<commit_message>
se agrega parte B
</commit_message>
<xml_diff>
--- a/LaboratorioGrupal.docx
+++ b/LaboratorioGrupal.docx
@@ -1,6 +1,6 @@
 
 <file path=word/document.xml><?xml version="1.0" encoding="utf-8"?>
-<w:document xmlns:wpc="http://schemas.microsoft.com/office/word/2010/wordprocessingCanvas" xmlns:cx="http://schemas.microsoft.com/office/drawing/2014/chartex" xmlns:cx1="http://schemas.microsoft.com/office/drawing/2015/9/8/chartex" xmlns:cx2="http://schemas.microsoft.com/office/drawing/2015/10/21/chartex" xmlns:cx3="http://schemas.microsoft.com/office/drawing/2016/5/9/chartex" xmlns:cx4="http://schemas.microsoft.com/office/drawing/2016/5/10/chartex" xmlns:cx5="http://schemas.microsoft.com/office/drawing/2016/5/11/chartex" xmlns:cx6="http://schemas.microsoft.com/office/drawing/2016/5/12/chartex" xmlns:cx7="http://schemas.microsoft.com/office/drawing/2016/5/13/chartex" xmlns:cx8="http://schemas.microsoft.com/office/drawing/2016/5/14/chartex" xmlns:mc="http://schemas.openxmlformats.org/markup-compatibility/2006" xmlns:aink="http://schemas.microsoft.com/office/drawing/2016/ink" xmlns:am3d="http://schemas.microsoft.com/office/drawing/2017/model3d" xmlns:o="urn:schemas-microsoft-com:office:office" xmlns:r="http://schemas.openxmlformats.org/officeDocument/2006/relationships" xmlns:m="http://schemas.openxmlformats.org/officeDocument/2006/math" xmlns:v="urn:schemas-microsoft-com:vml" xmlns:wp14="http://schemas.microsoft.com/office/word/2010/wordprocessingDrawing" xmlns:wp="http://schemas.openxmlformats.org/drawingml/2006/wordprocessingDrawing" xmlns:w10="urn:schemas-microsoft-com:office:word" xmlns:w="http://schemas.openxmlformats.org/wordprocessingml/2006/main" xmlns:w14="http://schemas.microsoft.com/office/word/2010/wordml" xmlns:w15="http://schemas.microsoft.com/office/word/2012/wordml" xmlns:w16cex="http://schemas.microsoft.com/office/word/2018/wordml/cex" xmlns:w16cid="http://schemas.microsoft.com/office/word/2016/wordml/cid" xmlns:w16="http://schemas.microsoft.com/office/word/2018/wordml" xmlns:w16sdtdh="http://schemas.microsoft.com/office/word/2020/wordml/sdtdatahash" xmlns:w16se="http://schemas.microsoft.com/office/word/2015/wordml/symex" xmlns:wpg="http://schemas.microsoft.com/office/word/2010/wordprocessingGroup" xmlns:wpi="http://schemas.microsoft.com/office/word/2010/wordprocessingInk" xmlns:wne="http://schemas.microsoft.com/office/word/2006/wordml" xmlns:wps="http://schemas.microsoft.com/office/word/2010/wordprocessingShape" mc:Ignorable="w14 w15 w16se w16cid w16 w16cex w16sdtdh wp14">
+<w:document xmlns:wpc="http://schemas.microsoft.com/office/word/2010/wordprocessingCanvas" xmlns:cx="http://schemas.microsoft.com/office/drawing/2014/chartex" xmlns:cx1="http://schemas.microsoft.com/office/drawing/2015/9/8/chartex" xmlns:cx2="http://schemas.microsoft.com/office/drawing/2015/10/21/chartex" xmlns:cx3="http://schemas.microsoft.com/office/drawing/2016/5/9/chartex" xmlns:cx4="http://schemas.microsoft.com/office/drawing/2016/5/10/chartex" xmlns:cx5="http://schemas.microsoft.com/office/drawing/2016/5/11/chartex" xmlns:cx6="http://schemas.microsoft.com/office/drawing/2016/5/12/chartex" xmlns:cx7="http://schemas.microsoft.com/office/drawing/2016/5/13/chartex" xmlns:cx8="http://schemas.microsoft.com/office/drawing/2016/5/14/chartex" xmlns:mc="http://schemas.openxmlformats.org/markup-compatibility/2006" xmlns:aink="http://schemas.microsoft.com/office/drawing/2016/ink" xmlns:am3d="http://schemas.microsoft.com/office/drawing/2017/model3d" xmlns:o="urn:schemas-microsoft-com:office:office" xmlns:oel="http://schemas.microsoft.com/office/2019/extlst" xmlns:r="http://schemas.openxmlformats.org/officeDocument/2006/relationships" xmlns:m="http://schemas.openxmlformats.org/officeDocument/2006/math" xmlns:v="urn:schemas-microsoft-com:vml" xmlns:wp14="http://schemas.microsoft.com/office/word/2010/wordprocessingDrawing" xmlns:wp="http://schemas.openxmlformats.org/drawingml/2006/wordprocessingDrawing" xmlns:w10="urn:schemas-microsoft-com:office:word" xmlns:w="http://schemas.openxmlformats.org/wordprocessingml/2006/main" xmlns:w14="http://schemas.microsoft.com/office/word/2010/wordml" xmlns:w15="http://schemas.microsoft.com/office/word/2012/wordml" xmlns:w16cex="http://schemas.microsoft.com/office/word/2018/wordml/cex" xmlns:w16cid="http://schemas.microsoft.com/office/word/2016/wordml/cid" xmlns:w16="http://schemas.microsoft.com/office/word/2018/wordml" xmlns:w16sdtdh="http://schemas.microsoft.com/office/word/2020/wordml/sdtdatahash" xmlns:w16se="http://schemas.microsoft.com/office/word/2015/wordml/symex" xmlns:wpg="http://schemas.microsoft.com/office/word/2010/wordprocessingGroup" xmlns:wpi="http://schemas.microsoft.com/office/word/2010/wordprocessingInk" xmlns:wne="http://schemas.microsoft.com/office/word/2006/wordml" xmlns:wps="http://schemas.microsoft.com/office/word/2010/wordprocessingShape" mc:Ignorable="w14 w15 w16se w16cid w16 w16cex w16sdtdh wp14">
   <w:body>
     <w:p>
       <w:pPr>
@@ -62,13 +62,8 @@
         <w:ind w:left="-5" w:hanging="10"/>
       </w:pPr>
       <w:r>
-        <w:t xml:space="preserve">Catedrático: Ingeniero Wilmer </w:t>
-      </w:r>
-      <w:proofErr w:type="spellStart"/>
-      <w:r>
-        <w:t>Tezén</w:t>
-      </w:r>
-      <w:proofErr w:type="spellEnd"/>
+        <w:t>Catedrático: Ingeniero Wilmer Tezén</w:t>
+      </w:r>
     </w:p>
     <w:p>
       <w:r>
@@ -83,7 +78,7 @@
         <mc:AlternateContent>
           <mc:Choice Requires="wpg">
             <w:drawing>
-              <wp:inline distT="0" distB="0" distL="0" distR="0" wp14:anchorId="17484D1F" wp14:editId="4BC3679E">
+              <wp:inline distT="0" distB="0" distL="0" distR="0" wp14:anchorId="2E81F3F6" wp14:editId="4A78F1FE">
                 <wp:extent cx="4979492" cy="1859915"/>
                 <wp:effectExtent l="0" t="0" r="12065" b="6985"/>
                 <wp:docPr id="633648543" name="Group 1"/>
@@ -411,35 +406,7 @@
         <w:rPr>
           <w:sz w:val="28"/>
         </w:rPr>
-        <w:t xml:space="preserve">Cindy Beatriz </w:t>
-      </w:r>
-      <w:proofErr w:type="spellStart"/>
-      <w:r>
-        <w:rPr>
-          <w:sz w:val="28"/>
-        </w:rPr>
-        <w:t>Pú</w:t>
-      </w:r>
-      <w:proofErr w:type="spellEnd"/>
-      <w:r>
-        <w:rPr>
-          <w:sz w:val="28"/>
-        </w:rPr>
-        <w:t xml:space="preserve"> </w:t>
-      </w:r>
-      <w:proofErr w:type="spellStart"/>
-      <w:r>
-        <w:rPr>
-          <w:sz w:val="28"/>
-        </w:rPr>
-        <w:t>Getellá</w:t>
-      </w:r>
-      <w:proofErr w:type="spellEnd"/>
-      <w:r>
-        <w:rPr>
-          <w:sz w:val="28"/>
-        </w:rPr>
-        <w:t xml:space="preserve">                </w:t>
+        <w:t xml:space="preserve">Cindy Beatriz Pú Getellá                </w:t>
       </w:r>
       <w:r>
         <w:rPr>
@@ -483,33 +450,11 @@
           <w:sz w:val="28"/>
         </w:rPr>
       </w:pPr>
-      <w:proofErr w:type="spellStart"/>
       <w:r>
         <w:rPr>
           <w:sz w:val="28"/>
         </w:rPr>
-        <w:t>Angel</w:t>
-      </w:r>
-      <w:proofErr w:type="spellEnd"/>
-      <w:r>
-        <w:rPr>
-          <w:sz w:val="28"/>
-        </w:rPr>
-        <w:t xml:space="preserve"> </w:t>
-      </w:r>
-      <w:proofErr w:type="spellStart"/>
-      <w:r>
-        <w:rPr>
-          <w:sz w:val="28"/>
-        </w:rPr>
-        <w:t>Amaliel</w:t>
-      </w:r>
-      <w:proofErr w:type="spellEnd"/>
-      <w:r>
-        <w:rPr>
-          <w:sz w:val="28"/>
-        </w:rPr>
-        <w:t xml:space="preserve"> Mayén Cardona      </w:t>
+        <w:t xml:space="preserve">Angel Amaliel Mayén Cardona      </w:t>
       </w:r>
       <w:r>
         <w:rPr>
@@ -539,21 +484,7 @@
         <w:rPr>
           <w:sz w:val="28"/>
         </w:rPr>
-        <w:t xml:space="preserve">Sindi Carina </w:t>
-      </w:r>
-      <w:proofErr w:type="spellStart"/>
-      <w:r>
-        <w:rPr>
-          <w:sz w:val="28"/>
-        </w:rPr>
-        <w:t>Acabal</w:t>
-      </w:r>
-      <w:proofErr w:type="spellEnd"/>
-      <w:r>
-        <w:rPr>
-          <w:sz w:val="28"/>
-        </w:rPr>
-        <w:t xml:space="preserve"> Hernández       7590-21-6522</w:t>
+        <w:t>Sindi Carina Acabal Hernández       7590-21-6522</w:t>
       </w:r>
     </w:p>
     <w:p/>
@@ -575,8 +506,11 @@
     </w:p>
     <w:p>
       <w:r>
+        <w:rPr>
+          <w:noProof/>
+        </w:rPr>
         <w:drawing>
-          <wp:inline distT="0" distB="0" distL="0" distR="0" wp14:anchorId="7AAD5E2B" wp14:editId="0D5B64A9">
+          <wp:inline distT="0" distB="0" distL="0" distR="0" wp14:anchorId="1CE87E02" wp14:editId="1E36D950">
             <wp:extent cx="5731510" cy="1384300"/>
             <wp:effectExtent l="0" t="0" r="2540" b="6350"/>
             <wp:docPr id="1" name="Picture 1"/>
@@ -619,8 +553,11 @@
     </w:p>
     <w:p>
       <w:r>
+        <w:rPr>
+          <w:noProof/>
+        </w:rPr>
         <w:drawing>
-          <wp:inline distT="0" distB="0" distL="0" distR="0" wp14:anchorId="797268A5" wp14:editId="7386E5F6">
+          <wp:inline distT="0" distB="0" distL="0" distR="0" wp14:anchorId="393B8996" wp14:editId="3C1A09D2">
             <wp:extent cx="5731510" cy="3922395"/>
             <wp:effectExtent l="0" t="0" r="2540" b="1905"/>
             <wp:docPr id="2" name="Picture 2"/>
@@ -673,8 +610,11 @@
     </w:p>
     <w:p>
       <w:r>
+        <w:rPr>
+          <w:noProof/>
+        </w:rPr>
         <w:drawing>
-          <wp:inline distT="0" distB="0" distL="0" distR="0" wp14:anchorId="231F53DE" wp14:editId="05577F2D">
+          <wp:inline distT="0" distB="0" distL="0" distR="0" wp14:anchorId="4DF79E52" wp14:editId="2F81923F">
             <wp:extent cx="5731510" cy="3187700"/>
             <wp:effectExtent l="0" t="0" r="2540" b="0"/>
             <wp:docPr id="3" name="Picture 3"/>
@@ -720,8 +660,11 @@
     </w:p>
     <w:p>
       <w:r>
+        <w:rPr>
+          <w:noProof/>
+        </w:rPr>
         <w:drawing>
-          <wp:inline distT="0" distB="0" distL="0" distR="0" wp14:anchorId="3669138A" wp14:editId="3E0A3D3F">
+          <wp:inline distT="0" distB="0" distL="0" distR="0" wp14:anchorId="18D4484A" wp14:editId="22E60AB6">
             <wp:extent cx="5731510" cy="835660"/>
             <wp:effectExtent l="0" t="0" r="2540" b="2540"/>
             <wp:docPr id="4" name="Picture 4"/>
@@ -759,8 +702,11 @@
     </w:p>
     <w:p>
       <w:r>
+        <w:rPr>
+          <w:noProof/>
+        </w:rPr>
         <w:drawing>
-          <wp:inline distT="0" distB="0" distL="0" distR="0" wp14:anchorId="412D3A1B" wp14:editId="54F092D6">
+          <wp:inline distT="0" distB="0" distL="0" distR="0" wp14:anchorId="6E35BB0F" wp14:editId="1E563193">
             <wp:extent cx="5731510" cy="685165"/>
             <wp:effectExtent l="0" t="0" r="2540" b="635"/>
             <wp:docPr id="5" name="Picture 5"/>
@@ -815,8 +761,11 @@
     </w:p>
     <w:p>
       <w:r>
+        <w:rPr>
+          <w:noProof/>
+        </w:rPr>
         <w:drawing>
-          <wp:inline distT="0" distB="0" distL="0" distR="0" wp14:anchorId="150ABE6E" wp14:editId="56B3FF86">
+          <wp:inline distT="0" distB="0" distL="0" distR="0" wp14:anchorId="6BB8A972" wp14:editId="26495A79">
             <wp:extent cx="5731510" cy="3140075"/>
             <wp:effectExtent l="0" t="0" r="2540" b="3175"/>
             <wp:docPr id="6" name="Picture 6"/>
@@ -852,8 +801,11 @@
         </w:drawing>
       </w:r>
       <w:r>
+        <w:rPr>
+          <w:noProof/>
+        </w:rPr>
         <w:drawing>
-          <wp:inline distT="0" distB="0" distL="0" distR="0" wp14:anchorId="6ACAF00A" wp14:editId="0852705C">
+          <wp:inline distT="0" distB="0" distL="0" distR="0" wp14:anchorId="6720A8B3" wp14:editId="6AF4C593">
             <wp:extent cx="5731510" cy="3409950"/>
             <wp:effectExtent l="0" t="0" r="2540" b="0"/>
             <wp:docPr id="7" name="Picture 7"/>
@@ -908,8 +860,11 @@
     </w:p>
     <w:p>
       <w:r>
+        <w:rPr>
+          <w:noProof/>
+        </w:rPr>
         <w:drawing>
-          <wp:inline distT="0" distB="0" distL="0" distR="0" wp14:anchorId="63675780" wp14:editId="17F69D30">
+          <wp:inline distT="0" distB="0" distL="0" distR="0" wp14:anchorId="4B4C7D7B" wp14:editId="5076B2DF">
             <wp:extent cx="5731510" cy="3171190"/>
             <wp:effectExtent l="0" t="0" r="2540" b="0"/>
             <wp:docPr id="8" name="Picture 8"/>
@@ -947,7 +902,7 @@
     </w:p>
     <w:p>
       <w:pPr>
-        <w:pStyle w:val="Heading1"/>
+        <w:pStyle w:val="Ttulo1"/>
       </w:pPr>
       <w:r>
         <w:t>PARTE A: Estadística del rendimiento</w:t>
@@ -955,7 +910,7 @@
     </w:p>
     <w:p>
       <w:pPr>
-        <w:pStyle w:val="Heading1"/>
+        <w:pStyle w:val="Ttulo1"/>
       </w:pPr>
       <w:r>
         <w:t>Paso 6</w:t>
@@ -963,7 +918,7 @@
     </w:p>
     <w:p>
       <w:pPr>
-        <w:pStyle w:val="Heading1"/>
+        <w:pStyle w:val="Ttulo1"/>
       </w:pPr>
       <w:r>
         <w:t>6.1</w:t>
@@ -971,11 +926,14 @@
     </w:p>
     <w:p>
       <w:pPr>
-        <w:pStyle w:val="Heading1"/>
-      </w:pPr>
-      <w:r>
+        <w:pStyle w:val="Ttulo1"/>
+      </w:pPr>
+      <w:r>
+        <w:rPr>
+          <w:noProof/>
+        </w:rPr>
         <w:drawing>
-          <wp:inline distT="0" distB="0" distL="0" distR="0" wp14:anchorId="477D2274" wp14:editId="7AACBE4B">
+          <wp:inline distT="0" distB="0" distL="0" distR="0" wp14:anchorId="74B8F105" wp14:editId="76034F1D">
             <wp:extent cx="5731510" cy="3192145"/>
             <wp:effectExtent l="0" t="0" r="2540" b="8255"/>
             <wp:docPr id="9" name="Picture 9"/>
@@ -1013,7 +971,7 @@
     </w:p>
     <w:p>
       <w:pPr>
-        <w:pStyle w:val="Heading1"/>
+        <w:pStyle w:val="Ttulo1"/>
       </w:pPr>
       <w:r>
         <w:lastRenderedPageBreak/>
@@ -1022,11 +980,14 @@
     </w:p>
     <w:p>
       <w:pPr>
-        <w:pStyle w:val="Heading1"/>
-      </w:pPr>
-      <w:r>
+        <w:pStyle w:val="Ttulo1"/>
+      </w:pPr>
+      <w:r>
+        <w:rPr>
+          <w:noProof/>
+        </w:rPr>
         <w:drawing>
-          <wp:inline distT="0" distB="0" distL="0" distR="0" wp14:anchorId="7BA9630F" wp14:editId="3CC8CA54">
+          <wp:inline distT="0" distB="0" distL="0" distR="0" wp14:anchorId="77FF06F0" wp14:editId="0DBA2BB0">
             <wp:extent cx="5731510" cy="2918460"/>
             <wp:effectExtent l="0" t="0" r="2540" b="0"/>
             <wp:docPr id="10" name="Picture 10"/>
@@ -1064,11 +1025,14 @@
     </w:p>
     <w:p>
       <w:pPr>
-        <w:pStyle w:val="Heading1"/>
-      </w:pPr>
-      <w:r>
+        <w:pStyle w:val="Ttulo1"/>
+      </w:pPr>
+      <w:r>
+        <w:rPr>
+          <w:noProof/>
+        </w:rPr>
         <w:drawing>
-          <wp:inline distT="0" distB="0" distL="0" distR="0" wp14:anchorId="29AA5112" wp14:editId="30E695BC">
+          <wp:inline distT="0" distB="0" distL="0" distR="0" wp14:anchorId="3A2AB436" wp14:editId="13505B14">
             <wp:extent cx="6209344" cy="3077155"/>
             <wp:effectExtent l="0" t="0" r="1270" b="9525"/>
             <wp:docPr id="11" name="Picture 11"/>
@@ -1106,12 +1070,15 @@
     </w:p>
     <w:p>
       <w:pPr>
-        <w:pStyle w:val="Heading1"/>
-      </w:pPr>
-      <w:r>
+        <w:pStyle w:val="Ttulo1"/>
+      </w:pPr>
+      <w:r>
+        <w:rPr>
+          <w:noProof/>
+        </w:rPr>
         <w:lastRenderedPageBreak/>
         <w:drawing>
-          <wp:inline distT="0" distB="0" distL="0" distR="0" wp14:anchorId="72A7486E" wp14:editId="680E6874">
+          <wp:inline distT="0" distB="0" distL="0" distR="0" wp14:anchorId="0CC2D17B" wp14:editId="28EB0C8A">
             <wp:extent cx="5748793" cy="3528507"/>
             <wp:effectExtent l="0" t="0" r="4445" b="0"/>
             <wp:docPr id="12" name="Picture 12"/>
@@ -1147,8 +1114,11 @@
         </w:drawing>
       </w:r>
       <w:r>
+        <w:rPr>
+          <w:noProof/>
+        </w:rPr>
         <w:drawing>
-          <wp:inline distT="0" distB="0" distL="0" distR="0" wp14:anchorId="6B8E002B" wp14:editId="73304EAD">
+          <wp:inline distT="0" distB="0" distL="0" distR="0" wp14:anchorId="5C4CCE17" wp14:editId="098B3EE5">
             <wp:extent cx="5731510" cy="3508375"/>
             <wp:effectExtent l="0" t="0" r="2540" b="0"/>
             <wp:docPr id="13" name="Picture 13"/>
@@ -1184,9 +1154,12 @@
         </w:drawing>
       </w:r>
       <w:r>
+        <w:rPr>
+          <w:noProof/>
+        </w:rPr>
         <w:lastRenderedPageBreak/>
         <w:drawing>
-          <wp:inline distT="0" distB="0" distL="0" distR="0" wp14:anchorId="58C65F33" wp14:editId="55515616">
+          <wp:inline distT="0" distB="0" distL="0" distR="0" wp14:anchorId="3DF8984E" wp14:editId="04F7BC42">
             <wp:extent cx="5731510" cy="2504440"/>
             <wp:effectExtent l="0" t="0" r="2540" b="0"/>
             <wp:docPr id="14" name="Picture 14"/>
@@ -1224,7 +1197,7 @@
     </w:p>
     <w:p>
       <w:pPr>
-        <w:pStyle w:val="Heading1"/>
+        <w:pStyle w:val="Ttulo1"/>
       </w:pPr>
       <w:r>
         <w:t>6.3</w:t>
@@ -1232,11 +1205,14 @@
     </w:p>
     <w:p>
       <w:pPr>
-        <w:pStyle w:val="Heading1"/>
-      </w:pPr>
-      <w:r>
+        <w:pStyle w:val="Ttulo1"/>
+      </w:pPr>
+      <w:r>
+        <w:rPr>
+          <w:noProof/>
+        </w:rPr>
         <w:drawing>
-          <wp:inline distT="0" distB="0" distL="0" distR="0" wp14:anchorId="1065F224" wp14:editId="5FA1D4C7">
+          <wp:inline distT="0" distB="0" distL="0" distR="0" wp14:anchorId="2EFDF43D" wp14:editId="5F8F8DD8">
             <wp:extent cx="5731510" cy="3056890"/>
             <wp:effectExtent l="0" t="0" r="2540" b="0"/>
             <wp:docPr id="15" name="Picture 15"/>
@@ -1274,16 +1250,962 @@
     </w:p>
     <w:p>
       <w:pPr>
-        <w:pStyle w:val="Heading1"/>
-      </w:pPr>
-    </w:p>
-    <w:p>
-      <w:pPr>
-        <w:pStyle w:val="Heading1"/>
-      </w:pPr>
-    </w:p>
-    <w:p/>
-    <w:p/>
+        <w:pStyle w:val="Ttulo1"/>
+      </w:pPr>
+    </w:p>
+    <w:p>
+      <w:pPr>
+        <w:pStyle w:val="Ttulo1"/>
+      </w:pPr>
+    </w:p>
+    <w:p/>
+    <w:p/>
+    <w:p/>
+    <w:p/>
+    <w:p>
+      <w:pPr>
+        <w:pStyle w:val="Ttulo1"/>
+      </w:pPr>
+      <w:r>
+        <w:lastRenderedPageBreak/>
+        <w:t>PARTE B: Observabilidad</w:t>
+      </w:r>
+    </w:p>
+    <w:p>
+      <w:pPr>
+        <w:pStyle w:val="Ttulo1"/>
+      </w:pPr>
+      <w:r>
+        <w:t>Paso 7</w:t>
+      </w:r>
+    </w:p>
+    <w:p>
+      <w:pPr>
+        <w:pStyle w:val="Ttulo1"/>
+      </w:pPr>
+      <w:r>
+        <w:t>7.1</w:t>
+      </w:r>
+    </w:p>
+    <w:p>
+      <w:pPr>
+        <w:pStyle w:val="Ttulo1"/>
+      </w:pPr>
+      <w:r>
+        <w:rPr>
+          <w:noProof/>
+        </w:rPr>
+        <w:drawing>
+          <wp:inline distT="0" distB="0" distL="0" distR="0" wp14:anchorId="21416E76" wp14:editId="66377A49">
+            <wp:extent cx="5731510" cy="1936585"/>
+            <wp:effectExtent l="0" t="0" r="0" b="0"/>
+            <wp:docPr id="900" name="Picture 900"/>
+            <wp:cNvGraphicFramePr>
+              <a:graphicFrameLocks xmlns:a="http://schemas.openxmlformats.org/drawingml/2006/main" noChangeAspect="1"/>
+            </wp:cNvGraphicFramePr>
+            <a:graphic xmlns:a="http://schemas.openxmlformats.org/drawingml/2006/main">
+              <a:graphicData uri="http://schemas.openxmlformats.org/drawingml/2006/picture">
+                <pic:pic xmlns:pic="http://schemas.openxmlformats.org/drawingml/2006/picture">
+                  <pic:nvPicPr>
+                    <pic:cNvPr id="0" name=""/>
+                    <pic:cNvPicPr/>
+                  </pic:nvPicPr>
+                  <pic:blipFill>
+                    <a:blip r:embed="rId21"/>
+                    <a:stretch>
+                      <a:fillRect/>
+                    </a:stretch>
+                  </pic:blipFill>
+                  <pic:spPr>
+                    <a:xfrm>
+                      <a:off x="0" y="0"/>
+                      <a:ext cx="5731510" cy="1936585"/>
+                    </a:xfrm>
+                    <a:prstGeom prst="rect">
+                      <a:avLst/>
+                    </a:prstGeom>
+                  </pic:spPr>
+                </pic:pic>
+              </a:graphicData>
+            </a:graphic>
+          </wp:inline>
+        </w:drawing>
+      </w:r>
+    </w:p>
+    <w:p>
+      <w:pPr>
+        <w:pStyle w:val="Ttulo1"/>
+      </w:pPr>
+      <w:r>
+        <w:t>7.2</w:t>
+      </w:r>
+    </w:p>
+    <w:p>
+      <w:pPr>
+        <w:pStyle w:val="Ttulo1"/>
+      </w:pPr>
+      <w:r>
+        <w:rPr>
+          <w:noProof/>
+        </w:rPr>
+        <w:drawing>
+          <wp:inline distT="0" distB="0" distL="0" distR="0" wp14:anchorId="795B1F0E" wp14:editId="37C34270">
+            <wp:extent cx="5731510" cy="1545356"/>
+            <wp:effectExtent l="0" t="0" r="0" b="0"/>
+            <wp:docPr id="901" name="Picture 901"/>
+            <wp:cNvGraphicFramePr>
+              <a:graphicFrameLocks xmlns:a="http://schemas.openxmlformats.org/drawingml/2006/main" noChangeAspect="1"/>
+            </wp:cNvGraphicFramePr>
+            <a:graphic xmlns:a="http://schemas.openxmlformats.org/drawingml/2006/main">
+              <a:graphicData uri="http://schemas.openxmlformats.org/drawingml/2006/picture">
+                <pic:pic xmlns:pic="http://schemas.openxmlformats.org/drawingml/2006/picture">
+                  <pic:nvPicPr>
+                    <pic:cNvPr id="0" name=""/>
+                    <pic:cNvPicPr/>
+                  </pic:nvPicPr>
+                  <pic:blipFill>
+                    <a:blip r:embed="rId22"/>
+                    <a:stretch>
+                      <a:fillRect/>
+                    </a:stretch>
+                  </pic:blipFill>
+                  <pic:spPr>
+                    <a:xfrm>
+                      <a:off x="0" y="0"/>
+                      <a:ext cx="5731510" cy="1545356"/>
+                    </a:xfrm>
+                    <a:prstGeom prst="rect">
+                      <a:avLst/>
+                    </a:prstGeom>
+                  </pic:spPr>
+                </pic:pic>
+              </a:graphicData>
+            </a:graphic>
+          </wp:inline>
+        </w:drawing>
+      </w:r>
+    </w:p>
+    <w:p>
+      <w:pPr>
+        <w:pStyle w:val="Ttulo1"/>
+      </w:pPr>
+      <w:r>
+        <w:rPr>
+          <w:noProof/>
+        </w:rPr>
+        <w:drawing>
+          <wp:inline distT="0" distB="0" distL="0" distR="0" wp14:anchorId="58D8A152" wp14:editId="09B1B071">
+            <wp:extent cx="5731510" cy="1447549"/>
+            <wp:effectExtent l="0" t="0" r="0" b="0"/>
+            <wp:docPr id="902" name="Picture 902"/>
+            <wp:cNvGraphicFramePr>
+              <a:graphicFrameLocks xmlns:a="http://schemas.openxmlformats.org/drawingml/2006/main" noChangeAspect="1"/>
+            </wp:cNvGraphicFramePr>
+            <a:graphic xmlns:a="http://schemas.openxmlformats.org/drawingml/2006/main">
+              <a:graphicData uri="http://schemas.openxmlformats.org/drawingml/2006/picture">
+                <pic:pic xmlns:pic="http://schemas.openxmlformats.org/drawingml/2006/picture">
+                  <pic:nvPicPr>
+                    <pic:cNvPr id="0" name=""/>
+                    <pic:cNvPicPr/>
+                  </pic:nvPicPr>
+                  <pic:blipFill>
+                    <a:blip r:embed="rId23"/>
+                    <a:stretch>
+                      <a:fillRect/>
+                    </a:stretch>
+                  </pic:blipFill>
+                  <pic:spPr>
+                    <a:xfrm>
+                      <a:off x="0" y="0"/>
+                      <a:ext cx="5731510" cy="1447549"/>
+                    </a:xfrm>
+                    <a:prstGeom prst="rect">
+                      <a:avLst/>
+                    </a:prstGeom>
+                  </pic:spPr>
+                </pic:pic>
+              </a:graphicData>
+            </a:graphic>
+          </wp:inline>
+        </w:drawing>
+      </w:r>
+    </w:p>
+    <w:p>
+      <w:pPr>
+        <w:pStyle w:val="Ttulo1"/>
+      </w:pPr>
+      <w:r>
+        <w:t>7.3</w:t>
+      </w:r>
+    </w:p>
+    <w:p/>
+    <w:tbl>
+      <w:tblPr>
+        <w:tblW w:w="9026" w:type="dxa"/>
+        <w:tblBorders>
+          <w:top w:val="single" w:sz="4" w:space="0" w:color="000000"/>
+          <w:left w:val="single" w:sz="4" w:space="0" w:color="000000"/>
+          <w:bottom w:val="single" w:sz="4" w:space="0" w:color="000000"/>
+          <w:right w:val="single" w:sz="4" w:space="0" w:color="000000"/>
+          <w:insideH w:val="single" w:sz="4" w:space="0" w:color="000000"/>
+          <w:insideV w:val="single" w:sz="4" w:space="0" w:color="000000"/>
+        </w:tblBorders>
+        <w:tblLook w:val="04A0" w:firstRow="1" w:lastRow="0" w:firstColumn="1" w:lastColumn="0" w:noHBand="0" w:noVBand="1"/>
+      </w:tblPr>
+      <w:tblGrid>
+        <w:gridCol w:w="1800"/>
+        <w:gridCol w:w="2400"/>
+        <w:gridCol w:w="3200"/>
+        <w:gridCol w:w="1626"/>
+      </w:tblGrid>
+      <w:tr>
+        <w:tc>
+          <w:tcPr>
+            <w:tcW w:w="1800" w:type="dxa"/>
+          </w:tcPr>
+          <w:p>
+            <w:r>
+              <w:rPr>
+                <w:rFonts w:ascii="Calibri" w:hAnsi="Calibri" w:cs="Calibri"/>
+                <w:b/>
+                <w:bCs/>
+              </w:rPr>
+              <w:t>Corrida</w:t>
+            </w:r>
+          </w:p>
+        </w:tc>
+        <w:tc>
+          <w:tcPr>
+            <w:tcW w:w="2400" w:type="dxa"/>
+          </w:tcPr>
+          <w:p>
+            <w:r>
+              <w:rPr>
+                <w:rFonts w:ascii="Calibri" w:hAnsi="Calibri" w:cs="Calibri"/>
+                <w:b/>
+                <w:bCs/>
+              </w:rPr>
+              <w:t>p95 de analizar.py (ms)</w:t>
+            </w:r>
+          </w:p>
+        </w:tc>
+        <w:tc>
+          <w:tcPr>
+            <w:tcW w:w="3200" w:type="dxa"/>
+          </w:tcPr>
+          <w:p>
+            <w:r>
+              <w:rPr>
+                <w:rFonts w:ascii="Calibri" w:hAnsi="Calibri" w:cs="Calibri"/>
+                <w:b/>
+                <w:bCs/>
+              </w:rPr>
+              <w:t>p95 de Prometheus (ms)</w:t>
+            </w:r>
+          </w:p>
+        </w:tc>
+        <w:tc>
+          <w:tcPr>
+            <w:tcW w:w="1626" w:type="dxa"/>
+          </w:tcPr>
+          <w:p>
+            <w:r>
+              <w:rPr>
+                <w:rFonts w:ascii="Calibri" w:hAnsi="Calibri" w:cs="Calibri"/>
+                <w:b/>
+                <w:bCs/>
+              </w:rPr>
+              <w:t>Diferencia (%)</w:t>
+            </w:r>
+          </w:p>
+        </w:tc>
+      </w:tr>
+      <w:tr>
+        <w:tc>
+          <w:tcPr>
+            <w:tcW w:w="1800" w:type="dxa"/>
+          </w:tcPr>
+          <w:p>
+            <w:r>
+              <w:rPr>
+                <w:rFonts w:ascii="Calibri" w:hAnsi="Calibri" w:cs="Calibri"/>
+              </w:rPr>
+              <w:lastRenderedPageBreak/>
+              <w:t>base1</w:t>
+            </w:r>
+          </w:p>
+        </w:tc>
+        <w:tc>
+          <w:tcPr>
+            <w:tcW w:w="2400" w:type="dxa"/>
+          </w:tcPr>
+          <w:p>
+            <w:r>
+              <w:rPr>
+                <w:rFonts w:ascii="Calibri" w:hAnsi="Calibri" w:cs="Calibri"/>
+              </w:rPr>
+              <w:t>710.2</w:t>
+            </w:r>
+          </w:p>
+        </w:tc>
+        <w:tc>
+          <w:tcPr>
+            <w:tcW w:w="3200" w:type="dxa"/>
+          </w:tcPr>
+          <w:p>
+            <w:r>
+              <w:rPr>
+                <w:rFonts w:ascii="Calibri" w:hAnsi="Calibri" w:cs="Calibri"/>
+              </w:rPr>
+              <w:t>sin datos (contador en 1 a las 15:49)</w:t>
+            </w:r>
+          </w:p>
+        </w:tc>
+        <w:tc>
+          <w:tcPr>
+            <w:tcW w:w="1626" w:type="dxa"/>
+          </w:tcPr>
+          <w:p/>
+        </w:tc>
+      </w:tr>
+      <w:tr>
+        <w:tc>
+          <w:tcPr>
+            <w:tcW w:w="1800" w:type="dxa"/>
+          </w:tcPr>
+          <w:p>
+            <w:r>
+              <w:rPr>
+                <w:rFonts w:ascii="Calibri" w:hAnsi="Calibri" w:cs="Calibri"/>
+              </w:rPr>
+              <w:t>19:11 a 19:13</w:t>
+            </w:r>
+          </w:p>
+        </w:tc>
+        <w:tc>
+          <w:tcPr>
+            <w:tcW w:w="2400" w:type="dxa"/>
+          </w:tcPr>
+          <w:p>
+            <w:r>
+              <w:rPr>
+                <w:rFonts w:ascii="Calibri" w:hAnsi="Calibri" w:cs="Calibri"/>
+              </w:rPr>
+              <w:t>161.3</w:t>
+            </w:r>
+          </w:p>
+        </w:tc>
+        <w:tc>
+          <w:tcPr>
+            <w:tcW w:w="3200" w:type="dxa"/>
+          </w:tcPr>
+          <w:p>
+            <w:r>
+              <w:rPr>
+                <w:rFonts w:ascii="Calibri" w:hAnsi="Calibri" w:cs="Calibri"/>
+              </w:rPr>
+              <w:t>435.1</w:t>
+            </w:r>
+          </w:p>
+        </w:tc>
+        <w:tc>
+          <w:tcPr>
+            <w:tcW w:w="1626" w:type="dxa"/>
+          </w:tcPr>
+          <w:p>
+            <w:r>
+              <w:rPr>
+                <w:rFonts w:ascii="Calibri" w:hAnsi="Calibri" w:cs="Calibri"/>
+              </w:rPr>
+              <w:t>+169.7</w:t>
+            </w:r>
+          </w:p>
+        </w:tc>
+      </w:tr>
+    </w:tbl>
+    <w:p>
+      <w:r>
+        <w:rPr>
+          <w:rFonts w:ascii="Calibri" w:hAnsi="Calibri" w:cs="Calibri"/>
+        </w:rPr>
+        <w:t>Diferencia = (435.1 - 161.3) / 161.3 x 100.</w:t>
+      </w:r>
+    </w:p>
+    <w:p>
+      <w:pPr>
+        <w:pStyle w:val="Ttulo1"/>
+      </w:pPr>
+      <w:r>
+        <w:t>7.4</w:t>
+      </w:r>
+    </w:p>
+    <w:p>
+      <w:pPr>
+        <w:pStyle w:val="Ttulo1"/>
+      </w:pPr>
+      <w:r>
+        <w:rPr>
+          <w:noProof/>
+        </w:rPr>
+        <w:drawing>
+          <wp:inline distT="0" distB="0" distL="0" distR="0" wp14:anchorId="00CA96E0" wp14:editId="770ACF36">
+            <wp:extent cx="5731510" cy="3203190"/>
+            <wp:effectExtent l="0" t="0" r="0" b="0"/>
+            <wp:docPr id="903" name="Picture 903"/>
+            <wp:cNvGraphicFramePr>
+              <a:graphicFrameLocks xmlns:a="http://schemas.openxmlformats.org/drawingml/2006/main" noChangeAspect="1"/>
+            </wp:cNvGraphicFramePr>
+            <a:graphic xmlns:a="http://schemas.openxmlformats.org/drawingml/2006/main">
+              <a:graphicData uri="http://schemas.openxmlformats.org/drawingml/2006/picture">
+                <pic:pic xmlns:pic="http://schemas.openxmlformats.org/drawingml/2006/picture">
+                  <pic:nvPicPr>
+                    <pic:cNvPr id="0" name=""/>
+                    <pic:cNvPicPr/>
+                  </pic:nvPicPr>
+                  <pic:blipFill>
+                    <a:blip r:embed="rId24"/>
+                    <a:stretch>
+                      <a:fillRect/>
+                    </a:stretch>
+                  </pic:blipFill>
+                  <pic:spPr>
+                    <a:xfrm>
+                      <a:off x="0" y="0"/>
+                      <a:ext cx="5731510" cy="3203190"/>
+                    </a:xfrm>
+                    <a:prstGeom prst="rect">
+                      <a:avLst/>
+                    </a:prstGeom>
+                  </pic:spPr>
+                </pic:pic>
+              </a:graphicData>
+            </a:graphic>
+          </wp:inline>
+        </w:drawing>
+      </w:r>
+    </w:p>
+    <w:p>
+      <w:pPr>
+        <w:pStyle w:val="Ttulo1"/>
+      </w:pPr>
+      <w:r>
+        <w:rPr>
+          <w:noProof/>
+        </w:rPr>
+        <w:drawing>
+          <wp:inline distT="0" distB="0" distL="0" distR="0" wp14:anchorId="74BC4187" wp14:editId="752AC79C">
+            <wp:extent cx="5731510" cy="1232372"/>
+            <wp:effectExtent l="0" t="0" r="0" b="0"/>
+            <wp:docPr id="904" name="Picture 904"/>
+            <wp:cNvGraphicFramePr>
+              <a:graphicFrameLocks xmlns:a="http://schemas.openxmlformats.org/drawingml/2006/main" noChangeAspect="1"/>
+            </wp:cNvGraphicFramePr>
+            <a:graphic xmlns:a="http://schemas.openxmlformats.org/drawingml/2006/main">
+              <a:graphicData uri="http://schemas.openxmlformats.org/drawingml/2006/picture">
+                <pic:pic xmlns:pic="http://schemas.openxmlformats.org/drawingml/2006/picture">
+                  <pic:nvPicPr>
+                    <pic:cNvPr id="0" name=""/>
+                    <pic:cNvPicPr/>
+                  </pic:nvPicPr>
+                  <pic:blipFill>
+                    <a:blip r:embed="rId25"/>
+                    <a:stretch>
+                      <a:fillRect/>
+                    </a:stretch>
+                  </pic:blipFill>
+                  <pic:spPr>
+                    <a:xfrm>
+                      <a:off x="0" y="0"/>
+                      <a:ext cx="5731510" cy="1232372"/>
+                    </a:xfrm>
+                    <a:prstGeom prst="rect">
+                      <a:avLst/>
+                    </a:prstGeom>
+                  </pic:spPr>
+                </pic:pic>
+              </a:graphicData>
+            </a:graphic>
+          </wp:inline>
+        </w:drawing>
+      </w:r>
+    </w:p>
+    <w:p>
+      <w:r>
+        <w:rPr>
+          <w:rFonts w:ascii="Calibri" w:hAnsi="Calibri" w:cs="Calibri"/>
+        </w:rPr>
+        <w:t>Valores a las 19:13:33, con la ventana de 30 s de cada panel. De base1 Prometheus no tiene serie, así que la tabla es de esta corrida.</w:t>
+      </w:r>
+    </w:p>
+    <w:tbl>
+      <w:tblPr>
+        <w:tblW w:w="9026" w:type="dxa"/>
+        <w:tblBorders>
+          <w:top w:val="single" w:sz="4" w:space="0" w:color="000000"/>
+          <w:left w:val="single" w:sz="4" w:space="0" w:color="000000"/>
+          <w:bottom w:val="single" w:sz="4" w:space="0" w:color="000000"/>
+          <w:right w:val="single" w:sz="4" w:space="0" w:color="000000"/>
+          <w:insideH w:val="single" w:sz="4" w:space="0" w:color="000000"/>
+          <w:insideV w:val="single" w:sz="4" w:space="0" w:color="000000"/>
+        </w:tblBorders>
+        <w:tblLook w:val="04A0" w:firstRow="1" w:lastRow="0" w:firstColumn="1" w:lastColumn="0" w:noHBand="0" w:noVBand="1"/>
+      </w:tblPr>
+      <w:tblGrid>
+        <w:gridCol w:w="1700"/>
+        <w:gridCol w:w="2300"/>
+        <w:gridCol w:w="1900"/>
+        <w:gridCol w:w="3126"/>
+      </w:tblGrid>
+      <w:tr>
+        <w:tc>
+          <w:tcPr>
+            <w:tcW w:w="1700" w:type="dxa"/>
+          </w:tcPr>
+          <w:p>
+            <w:r>
+              <w:rPr>
+                <w:rFonts w:ascii="Calibri" w:hAnsi="Calibri" w:cs="Calibri"/>
+                <w:b/>
+                <w:bCs/>
+              </w:rPr>
+              <w:t>Panel</w:t>
+            </w:r>
+          </w:p>
+        </w:tc>
+        <w:tc>
+          <w:tcPr>
+            <w:tcW w:w="2300" w:type="dxa"/>
+          </w:tcPr>
+          <w:p>
+            <w:r>
+              <w:rPr>
+                <w:rFonts w:ascii="Calibri" w:hAnsi="Calibri" w:cs="Calibri"/>
+                <w:b/>
+                <w:bCs/>
+              </w:rPr>
+              <w:t>Qué pregunta responde</w:t>
+            </w:r>
+          </w:p>
+        </w:tc>
+        <w:tc>
+          <w:tcPr>
+            <w:tcW w:w="1900" w:type="dxa"/>
+          </w:tcPr>
+          <w:p>
+            <w:r>
+              <w:rPr>
+                <w:rFonts w:ascii="Calibri" w:hAnsi="Calibri" w:cs="Calibri"/>
+                <w:b/>
+                <w:bCs/>
+              </w:rPr>
+              <w:t>Valor a las 19:13:33</w:t>
+            </w:r>
+          </w:p>
+        </w:tc>
+        <w:tc>
+          <w:tcPr>
+            <w:tcW w:w="3126" w:type="dxa"/>
+          </w:tcPr>
+          <w:p>
+            <w:r>
+              <w:rPr>
+                <w:rFonts w:ascii="Calibri" w:hAnsi="Calibri" w:cs="Calibri"/>
+                <w:b/>
+                <w:bCs/>
+              </w:rPr>
+              <w:t>¿La responde?</w:t>
+            </w:r>
+          </w:p>
+        </w:tc>
+      </w:tr>
+      <w:tr>
+        <w:tc>
+          <w:tcPr>
+            <w:tcW w:w="1700" w:type="dxa"/>
+          </w:tcPr>
+          <w:p>
+            <w:r>
+              <w:rPr>
+                <w:rFonts w:ascii="Calibri" w:hAnsi="Calibri" w:cs="Calibri"/>
+              </w:rPr>
+              <w:t>Lecturas por segundo</w:t>
+            </w:r>
+          </w:p>
+        </w:tc>
+        <w:tc>
+          <w:tcPr>
+            <w:tcW w:w="2300" w:type="dxa"/>
+          </w:tcPr>
+          <w:p>
+            <w:r>
+              <w:rPr>
+                <w:rFonts w:ascii="Calibri" w:hAnsi="Calibri" w:cs="Calibri"/>
+              </w:rPr>
+              <w:t>¿Cuántas lecturas por segundo acepta?</w:t>
+            </w:r>
+          </w:p>
+        </w:tc>
+        <w:tc>
+          <w:tcPr>
+            <w:tcW w:w="1900" w:type="dxa"/>
+          </w:tcPr>
+          <w:p>
+            <w:r>
+              <w:rPr>
+                <w:rFonts w:ascii="Calibri" w:hAnsi="Calibri" w:cs="Calibri"/>
+              </w:rPr>
+              <w:t>102.80</w:t>
+            </w:r>
+          </w:p>
+        </w:tc>
+        <w:tc>
+          <w:tcPr>
+            <w:tcW w:w="3126" w:type="dxa"/>
+          </w:tcPr>
+          <w:p>
+            <w:r>
+              <w:rPr>
+                <w:rFonts w:ascii="Calibri" w:hAnsi="Calibri" w:cs="Calibri"/>
+              </w:rPr>
+              <w:t>Sí. analizar.py dio 101.49 y k6 102.32. La ventana de 30 s no tiene que salir idéntica.</w:t>
+            </w:r>
+          </w:p>
+        </w:tc>
+      </w:tr>
+      <w:tr>
+        <w:tc>
+          <w:tcPr>
+            <w:tcW w:w="1700" w:type="dxa"/>
+          </w:tcPr>
+          <w:p>
+            <w:r>
+              <w:rPr>
+                <w:rFonts w:ascii="Calibri" w:hAnsi="Calibri" w:cs="Calibri"/>
+              </w:rPr>
+              <w:t>Tráfico por réplica</w:t>
+            </w:r>
+          </w:p>
+        </w:tc>
+        <w:tc>
+          <w:tcPr>
+            <w:tcW w:w="2300" w:type="dxa"/>
+          </w:tcPr>
+          <w:p>
+            <w:r>
+              <w:rPr>
+                <w:rFonts w:ascii="Calibri" w:hAnsi="Calibri" w:cs="Calibri"/>
+              </w:rPr>
+              <w:t>¿Cómo se reparte?</w:t>
+            </w:r>
+          </w:p>
+        </w:tc>
+        <w:tc>
+          <w:tcPr>
+            <w:tcW w:w="1900" w:type="dxa"/>
+          </w:tcPr>
+          <w:p>
+            <w:r>
+              <w:rPr>
+                <w:rFonts w:ascii="Calibri" w:hAnsi="Calibri" w:cs="Calibri"/>
+              </w:rPr>
+              <w:t>solo api-1, 102.80</w:t>
+            </w:r>
+          </w:p>
+        </w:tc>
+        <w:tc>
+          <w:tcPr>
+            <w:tcW w:w="3126" w:type="dxa"/>
+          </w:tcPr>
+          <w:p>
+            <w:r>
+              <w:rPr>
+                <w:rFonts w:ascii="Calibri" w:hAnsi="Calibri" w:cs="Calibri"/>
+              </w:rPr>
+              <w:t>Sí. api-2 y api-3 no están levantadas.</w:t>
+            </w:r>
+          </w:p>
+        </w:tc>
+      </w:tr>
+      <w:tr>
+        <w:tc>
+          <w:tcPr>
+            <w:tcW w:w="1700" w:type="dxa"/>
+          </w:tcPr>
+          <w:p>
+            <w:r>
+              <w:rPr>
+                <w:rFonts w:ascii="Calibri" w:hAnsi="Calibri" w:cs="Calibri"/>
+              </w:rPr>
+              <w:lastRenderedPageBreak/>
+              <w:t>p95 del sistema</w:t>
+            </w:r>
+          </w:p>
+        </w:tc>
+        <w:tc>
+          <w:tcPr>
+            <w:tcW w:w="2300" w:type="dxa"/>
+          </w:tcPr>
+          <w:p>
+            <w:r>
+              <w:rPr>
+                <w:rFonts w:ascii="Calibri" w:hAnsi="Calibri" w:cs="Calibri"/>
+              </w:rPr>
+              <w:t>¿Cuál es el p95, en ms?</w:t>
+            </w:r>
+          </w:p>
+        </w:tc>
+        <w:tc>
+          <w:tcPr>
+            <w:tcW w:w="1900" w:type="dxa"/>
+          </w:tcPr>
+          <w:p>
+            <w:r>
+              <w:rPr>
+                <w:rFonts w:ascii="Calibri" w:hAnsi="Calibri" w:cs="Calibri"/>
+              </w:rPr>
+              <w:t>432.0</w:t>
+            </w:r>
+          </w:p>
+        </w:tc>
+        <w:tc>
+          <w:tcPr>
+            <w:tcW w:w="3126" w:type="dxa"/>
+          </w:tcPr>
+          <w:p>
+            <w:r>
+              <w:rPr>
+                <w:rFonts w:ascii="Calibri" w:hAnsi="Calibri" w:cs="Calibri"/>
+              </w:rPr>
+              <w:t>No. El p95 de las solicitudes es 161.3 ms. Con una sola réplica el avg() no cambia el número. El error es el bucket de 0.1 a 0.5.</w:t>
+            </w:r>
+          </w:p>
+        </w:tc>
+      </w:tr>
+      <w:tr>
+        <w:tc>
+          <w:tcPr>
+            <w:tcW w:w="1700" w:type="dxa"/>
+          </w:tcPr>
+          <w:p>
+            <w:r>
+              <w:rPr>
+                <w:rFonts w:ascii="Calibri" w:hAnsi="Calibri" w:cs="Calibri"/>
+              </w:rPr>
+              <w:t>p50 y p99</w:t>
+            </w:r>
+          </w:p>
+        </w:tc>
+        <w:tc>
+          <w:tcPr>
+            <w:tcW w:w="2300" w:type="dxa"/>
+          </w:tcPr>
+          <w:p>
+            <w:r>
+              <w:rPr>
+                <w:rFonts w:ascii="Calibri" w:hAnsi="Calibri" w:cs="Calibri"/>
+              </w:rPr>
+              <w:t>¿Cuál es el p50 y el p99?</w:t>
+            </w:r>
+          </w:p>
+        </w:tc>
+        <w:tc>
+          <w:tcPr>
+            <w:tcW w:w="1900" w:type="dxa"/>
+          </w:tcPr>
+          <w:p>
+            <w:r>
+              <w:rPr>
+                <w:rFonts w:ascii="Calibri" w:hAnsi="Calibri" w:cs="Calibri"/>
+              </w:rPr>
+              <w:t>70.8 y 486.4</w:t>
+            </w:r>
+          </w:p>
+        </w:tc>
+        <w:tc>
+          <w:tcPr>
+            <w:tcW w:w="3126" w:type="dxa"/>
+          </w:tcPr>
+          <w:p>
+            <w:r>
+              <w:rPr>
+                <w:rFonts w:ascii="Calibri" w:hAnsi="Calibri" w:cs="Calibri"/>
+              </w:rPr>
+              <w:t>El p50 se acerca a la mediana del CSV (99.1), pero interpola dentro de 0 a 100 ms y no incluye a Traefik. El p99 no: en el CSV es 173.0 y el panel dice 486.</w:t>
+            </w:r>
+          </w:p>
+        </w:tc>
+      </w:tr>
+      <w:tr>
+        <w:tc>
+          <w:tcPr>
+            <w:tcW w:w="1700" w:type="dxa"/>
+          </w:tcPr>
+          <w:p>
+            <w:r>
+              <w:rPr>
+                <w:rFonts w:ascii="Calibri" w:hAnsi="Calibri" w:cs="Calibri"/>
+              </w:rPr>
+              <w:t>Porcentaje de fallas</w:t>
+            </w:r>
+          </w:p>
+        </w:tc>
+        <w:tc>
+          <w:tcPr>
+            <w:tcW w:w="2300" w:type="dxa"/>
+          </w:tcPr>
+          <w:p>
+            <w:r>
+              <w:rPr>
+                <w:rFonts w:ascii="Calibri" w:hAnsi="Calibri" w:cs="Calibri"/>
+              </w:rPr>
+              <w:t>¿Qué porcentaje falla?</w:t>
+            </w:r>
+          </w:p>
+        </w:tc>
+        <w:tc>
+          <w:tcPr>
+            <w:tcW w:w="1900" w:type="dxa"/>
+          </w:tcPr>
+          <w:p>
+            <w:r>
+              <w:rPr>
+                <w:rFonts w:ascii="Calibri" w:hAnsi="Calibri" w:cs="Calibri"/>
+              </w:rPr>
+              <w:t>sin serie</w:t>
+            </w:r>
+          </w:p>
+        </w:tc>
+        <w:tc>
+          <w:tcPr>
+            <w:tcW w:w="3126" w:type="dxa"/>
+          </w:tcPr>
+          <w:p>
+            <w:r>
+              <w:rPr>
+                <w:rFonts w:ascii="Calibri" w:hAnsi="Calibri" w:cs="Calibri"/>
+              </w:rPr>
+              <w:t>No del todo. k6 falló 0 de 12280. Si no existe estado distinto de 201, el panel queda vacío, y vacío no es 0%.</w:t>
+            </w:r>
+          </w:p>
+        </w:tc>
+      </w:tr>
+      <w:tr>
+        <w:tc>
+          <w:tcPr>
+            <w:tcW w:w="1700" w:type="dxa"/>
+          </w:tcPr>
+          <w:p>
+            <w:r>
+              <w:rPr>
+                <w:rFonts w:ascii="Calibri" w:hAnsi="Calibri" w:cs="Calibri"/>
+              </w:rPr>
+              <w:t>Traefik por código</w:t>
+            </w:r>
+          </w:p>
+        </w:tc>
+        <w:tc>
+          <w:tcPr>
+            <w:tcW w:w="2300" w:type="dxa"/>
+          </w:tcPr>
+          <w:p>
+            <w:r>
+              <w:rPr>
+                <w:rFonts w:ascii="Calibri" w:hAnsi="Calibri" w:cs="Calibri"/>
+              </w:rPr>
+              <w:t>¿Cuántas van por código HTTP?</w:t>
+            </w:r>
+          </w:p>
+        </w:tc>
+        <w:tc>
+          <w:tcPr>
+            <w:tcW w:w="1900" w:type="dxa"/>
+          </w:tcPr>
+          <w:p>
+            <w:r>
+              <w:rPr>
+                <w:rFonts w:ascii="Calibri" w:hAnsi="Calibri" w:cs="Calibri"/>
+              </w:rPr>
+              <w:t>201 en 102.53 y 200 en 0</w:t>
+            </w:r>
+          </w:p>
+        </w:tc>
+        <w:tc>
+          <w:tcPr>
+            <w:tcW w:w="3126" w:type="dxa"/>
+          </w:tcPr>
+          <w:p>
+            <w:r>
+              <w:rPr>
+                <w:rFonts w:ascii="Calibri" w:hAnsi="Calibri" w:cs="Calibri"/>
+              </w:rPr>
+              <w:t>Sí. Empata con las lecturas aceptadas.</w:t>
+            </w:r>
+          </w:p>
+        </w:tc>
+      </w:tr>
+      <w:tr>
+        <w:tc>
+          <w:tcPr>
+            <w:tcW w:w="1700" w:type="dxa"/>
+          </w:tcPr>
+          <w:p>
+            <w:r>
+              <w:rPr>
+                <w:rFonts w:ascii="Calibri" w:hAnsi="Calibri" w:cs="Calibri"/>
+              </w:rPr>
+              <w:t>Réplicas activas</w:t>
+            </w:r>
+          </w:p>
+        </w:tc>
+        <w:tc>
+          <w:tcPr>
+            <w:tcW w:w="2300" w:type="dxa"/>
+          </w:tcPr>
+          <w:p>
+            <w:r>
+              <w:rPr>
+                <w:rFonts w:ascii="Calibri" w:hAnsi="Calibri" w:cs="Calibri"/>
+              </w:rPr>
+              <w:t>¿Cuáles reporta Prometheus?</w:t>
+            </w:r>
+          </w:p>
+        </w:tc>
+        <w:tc>
+          <w:tcPr>
+            <w:tcW w:w="1900" w:type="dxa"/>
+          </w:tcPr>
+          <w:p>
+            <w:r>
+              <w:rPr>
+                <w:rFonts w:ascii="Calibri" w:hAnsi="Calibri" w:cs="Calibri"/>
+              </w:rPr>
+              <w:t>api-1 = 1, api-2 = 0, api-3 = 0</w:t>
+            </w:r>
+          </w:p>
+        </w:tc>
+        <w:tc>
+          <w:tcPr>
+            <w:tcW w:w="3126" w:type="dxa"/>
+          </w:tcPr>
+          <w:p>
+            <w:r>
+              <w:rPr>
+                <w:rFonts w:ascii="Calibri" w:hAnsi="Calibri" w:cs="Calibri"/>
+              </w:rPr>
+              <w:t>Sí. Solo api-1 está arriba.</w:t>
+            </w:r>
+          </w:p>
+        </w:tc>
+      </w:tr>
+    </w:tbl>
+    <w:p>
+      <w:r>
+        <w:rPr>
+          <w:rFonts w:ascii="Calibri" w:hAnsi="Calibri" w:cs="Calibri"/>
+        </w:rPr>
+        <w:t>RED. R: lecturas por segundo, tráfico por réplica y Traefik por código. E: porcentaje de fallas, y el código de Traefik si saliera un 5xx. D: p50, p95 y p99.</w:t>
+      </w:r>
+    </w:p>
     <w:sectPr>
       <w:pgSz w:w="11906" w:h="16838"/>
       <w:pgMar w:top="1440" w:right="1440" w:bottom="1440" w:left="1440" w:header="708" w:footer="708" w:gutter="0"/>
@@ -1695,10 +2617,10 @@
     <w:name w:val="Normal"/>
     <w:qFormat/>
   </w:style>
-  <w:style w:type="paragraph" w:styleId="Heading1">
+  <w:style w:type="paragraph" w:styleId="Ttulo1">
     <w:name w:val="heading 1"/>
     <w:basedOn w:val="Normal"/>
-    <w:link w:val="Heading1Char"/>
+    <w:link w:val="Ttulo1Car"/>
     <w:uiPriority w:val="9"/>
     <w:qFormat/>
     <w:rsid w:val="000E250C"/>
@@ -1717,13 +2639,13 @@
       <w14:ligatures w14:val="none"/>
     </w:rPr>
   </w:style>
-  <w:style w:type="character" w:default="1" w:styleId="DefaultParagraphFont">
+  <w:style w:type="character" w:default="1" w:styleId="Fuentedeprrafopredeter">
     <w:name w:val="Default Paragraph Font"/>
     <w:uiPriority w:val="1"/>
     <w:semiHidden/>
     <w:unhideWhenUsed/>
   </w:style>
-  <w:style w:type="table" w:default="1" w:styleId="TableNormal">
+  <w:style w:type="table" w:default="1" w:styleId="Tablanormal">
     <w:name w:val="Normal Table"/>
     <w:uiPriority w:val="99"/>
     <w:semiHidden/>
@@ -1738,16 +2660,16 @@
       </w:tblCellMar>
     </w:tblPr>
   </w:style>
-  <w:style w:type="numbering" w:default="1" w:styleId="NoList">
+  <w:style w:type="numbering" w:default="1" w:styleId="Sinlista">
     <w:name w:val="No List"/>
     <w:uiPriority w:val="99"/>
     <w:semiHidden/>
     <w:unhideWhenUsed/>
   </w:style>
-  <w:style w:type="character" w:customStyle="1" w:styleId="Heading1Char">
-    <w:name w:val="Heading 1 Char"/>
-    <w:basedOn w:val="DefaultParagraphFont"/>
-    <w:link w:val="Heading1"/>
+  <w:style w:type="character" w:customStyle="1" w:styleId="Ttulo1Car">
+    <w:name w:val="Título 1 Car"/>
+    <w:basedOn w:val="Fuentedeprrafopredeter"/>
+    <w:link w:val="Ttulo1"/>
     <w:uiPriority w:val="9"/>
     <w:rsid w:val="000E250C"/>
     <w:rPr>

</xml_diff>

<commit_message>
Cindy: capturas de la Parte C en el documento
</commit_message>
<xml_diff>
--- a/LaboratorioGrupal.docx
+++ b/LaboratorioGrupal.docx
@@ -1,6 +1,6 @@
 
 <file path=word/document.xml><?xml version="1.0" encoding="utf-8"?>
-<w:document xmlns:wpc="http://schemas.microsoft.com/office/word/2010/wordprocessingCanvas" xmlns:cx="http://schemas.microsoft.com/office/drawing/2014/chartex" xmlns:cx1="http://schemas.microsoft.com/office/drawing/2015/9/8/chartex" xmlns:cx2="http://schemas.microsoft.com/office/drawing/2015/10/21/chartex" xmlns:cx3="http://schemas.microsoft.com/office/drawing/2016/5/9/chartex" xmlns:cx4="http://schemas.microsoft.com/office/drawing/2016/5/10/chartex" xmlns:cx5="http://schemas.microsoft.com/office/drawing/2016/5/11/chartex" xmlns:cx6="http://schemas.microsoft.com/office/drawing/2016/5/12/chartex" xmlns:cx7="http://schemas.microsoft.com/office/drawing/2016/5/13/chartex" xmlns:cx8="http://schemas.microsoft.com/office/drawing/2016/5/14/chartex" xmlns:mc="http://schemas.openxmlformats.org/markup-compatibility/2006" xmlns:aink="http://schemas.microsoft.com/office/drawing/2016/ink" xmlns:am3d="http://schemas.microsoft.com/office/drawing/2017/model3d" xmlns:o="urn:schemas-microsoft-com:office:office" xmlns:oel="http://schemas.microsoft.com/office/2019/extlst" xmlns:r="http://schemas.openxmlformats.org/officeDocument/2006/relationships" xmlns:m="http://schemas.openxmlformats.org/officeDocument/2006/math" xmlns:v="urn:schemas-microsoft-com:vml" xmlns:wp14="http://schemas.microsoft.com/office/word/2010/wordprocessingDrawing" xmlns:wp="http://schemas.openxmlformats.org/drawingml/2006/wordprocessingDrawing" xmlns:w10="urn:schemas-microsoft-com:office:word" xmlns:w="http://schemas.openxmlformats.org/wordprocessingml/2006/main" xmlns:w14="http://schemas.microsoft.com/office/word/2010/wordml" xmlns:w15="http://schemas.microsoft.com/office/word/2012/wordml" xmlns:w16cex="http://schemas.microsoft.com/office/word/2018/wordml/cex" xmlns:w16cid="http://schemas.microsoft.com/office/word/2016/wordml/cid" xmlns:w16="http://schemas.microsoft.com/office/word/2018/wordml" xmlns:w16sdtdh="http://schemas.microsoft.com/office/word/2020/wordml/sdtdatahash" xmlns:w16se="http://schemas.microsoft.com/office/word/2015/wordml/symex" xmlns:wpg="http://schemas.microsoft.com/office/word/2010/wordprocessingGroup" xmlns:wpi="http://schemas.microsoft.com/office/word/2010/wordprocessingInk" xmlns:wne="http://schemas.microsoft.com/office/word/2006/wordml" xmlns:wps="http://schemas.microsoft.com/office/word/2010/wordprocessingShape" mc:Ignorable="w14 w15 w16se w16cid w16 w16cex w16sdtdh wp14">
+<w:document xmlns:wpc="http://schemas.microsoft.com/office/word/2010/wordprocessingCanvas" xmlns:cx="http://schemas.microsoft.com/office/drawing/2014/chartex" xmlns:cx1="http://schemas.microsoft.com/office/drawing/2015/9/8/chartex" xmlns:cx2="http://schemas.microsoft.com/office/drawing/2015/10/21/chartex" xmlns:cx3="http://schemas.microsoft.com/office/drawing/2016/5/9/chartex" xmlns:cx4="http://schemas.microsoft.com/office/drawing/2016/5/10/chartex" xmlns:cx5="http://schemas.microsoft.com/office/drawing/2016/5/11/chartex" xmlns:cx6="http://schemas.microsoft.com/office/drawing/2016/5/12/chartex" xmlns:cx7="http://schemas.microsoft.com/office/drawing/2016/5/13/chartex" xmlns:cx8="http://schemas.microsoft.com/office/drawing/2016/5/14/chartex" xmlns:mc="http://schemas.openxmlformats.org/markup-compatibility/2006" xmlns:aink="http://schemas.microsoft.com/office/drawing/2016/ink" xmlns:am3d="http://schemas.microsoft.com/office/drawing/2017/model3d" xmlns:o="urn:schemas-microsoft-com:office:office" xmlns:r="http://schemas.openxmlformats.org/officeDocument/2006/relationships" xmlns:m="http://schemas.openxmlformats.org/officeDocument/2006/math" xmlns:v="urn:schemas-microsoft-com:vml" xmlns:wp14="http://schemas.microsoft.com/office/word/2010/wordprocessingDrawing" xmlns:wp="http://schemas.openxmlformats.org/drawingml/2006/wordprocessingDrawing" xmlns:w10="urn:schemas-microsoft-com:office:word" xmlns:w="http://schemas.openxmlformats.org/wordprocessingml/2006/main" xmlns:w14="http://schemas.microsoft.com/office/word/2010/wordml" xmlns:w15="http://schemas.microsoft.com/office/word/2012/wordml" xmlns:w16cex="http://schemas.microsoft.com/office/word/2018/wordml/cex" xmlns:w16cid="http://schemas.microsoft.com/office/word/2016/wordml/cid" xmlns:w16="http://schemas.microsoft.com/office/word/2018/wordml" xmlns:w16sdtdh="http://schemas.microsoft.com/office/word/2020/wordml/sdtdatahash" xmlns:w16se="http://schemas.microsoft.com/office/word/2015/wordml/symex" xmlns:wpg="http://schemas.microsoft.com/office/word/2010/wordprocessingGroup" xmlns:wpi="http://schemas.microsoft.com/office/word/2010/wordprocessingInk" xmlns:wne="http://schemas.microsoft.com/office/word/2006/wordml" xmlns:wps="http://schemas.microsoft.com/office/word/2010/wordprocessingShape" mc:Ignorable="w14 w15 w16se w16cid w16 w16cex w16sdtdh wp14">
   <w:body>
     <w:p>
       <w:pPr>
@@ -62,8 +62,13 @@
         <w:ind w:left="-5" w:hanging="10"/>
       </w:pPr>
       <w:r>
-        <w:t>Catedrático: Ingeniero Wilmer Tezén</w:t>
-      </w:r>
+        <w:t xml:space="preserve">Catedrático: Ingeniero Wilmer </w:t>
+      </w:r>
+      <w:proofErr w:type="spellStart"/>
+      <w:r>
+        <w:t>Tezén</w:t>
+      </w:r>
+      <w:proofErr w:type="spellEnd"/>
     </w:p>
     <w:p>
       <w:r>
@@ -262,7 +267,7 @@
               </wp:inline>
             </w:drawing>
           </mc:Choice>
-          <mc:Fallback>
+          <mc:Fallback xmlns:oel="http://schemas.microsoft.com/office/2019/extlst">
             <w:pict>
               <v:group w14:anchorId="17484D1F" id="Group 1" o:spid="_x0000_s1026" style="width:392.1pt;height:146.45pt;mso-position-horizontal-relative:char;mso-position-vertical-relative:line" coordorigin="-6574,831" coordsize="49796,18599" o:gfxdata="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">
                 <v:shapetype id="_x0000_t75" coordsize="21600,21600" o:spt="75" o:preferrelative="t" path="m@4@5l@4@11@9@11@9@5xe" filled="f" stroked="f">
@@ -436,7 +441,21 @@
         <w:rPr>
           <w:sz w:val="28"/>
         </w:rPr>
-        <w:t xml:space="preserve">Valeria Melissa Guzman Estrada     7590-23-4125 </w:t>
+        <w:t xml:space="preserve">Valeria Melissa </w:t>
+      </w:r>
+      <w:proofErr w:type="spellStart"/>
+      <w:r>
+        <w:rPr>
+          <w:sz w:val="28"/>
+        </w:rPr>
+        <w:t>Guzman</w:t>
+      </w:r>
+      <w:proofErr w:type="spellEnd"/>
+      <w:r>
+        <w:rPr>
+          <w:sz w:val="28"/>
+        </w:rPr>
+        <w:t xml:space="preserve"> Estrada     7590-23-4125 </w:t>
       </w:r>
     </w:p>
     <w:p>
@@ -450,11 +469,33 @@
           <w:sz w:val="28"/>
         </w:rPr>
       </w:pPr>
+      <w:proofErr w:type="spellStart"/>
       <w:r>
         <w:rPr>
           <w:sz w:val="28"/>
         </w:rPr>
-        <w:t xml:space="preserve">Angel Amaliel Mayén Cardona      </w:t>
+        <w:t>Angel</w:t>
+      </w:r>
+      <w:proofErr w:type="spellEnd"/>
+      <w:r>
+        <w:rPr>
+          <w:sz w:val="28"/>
+        </w:rPr>
+        <w:t xml:space="preserve"> </w:t>
+      </w:r>
+      <w:proofErr w:type="spellStart"/>
+      <w:r>
+        <w:rPr>
+          <w:sz w:val="28"/>
+        </w:rPr>
+        <w:t>Amaliel</w:t>
+      </w:r>
+      <w:proofErr w:type="spellEnd"/>
+      <w:r>
+        <w:rPr>
+          <w:sz w:val="28"/>
+        </w:rPr>
+        <w:t xml:space="preserve"> Mayén Cardona      </w:t>
       </w:r>
       <w:r>
         <w:rPr>
@@ -484,7 +525,21 @@
         <w:rPr>
           <w:sz w:val="28"/>
         </w:rPr>
-        <w:t>Sindi Carina Acabal Hernández       7590-21-6522</w:t>
+        <w:t xml:space="preserve">Sindi Carina </w:t>
+      </w:r>
+      <w:proofErr w:type="spellStart"/>
+      <w:r>
+        <w:rPr>
+          <w:sz w:val="28"/>
+        </w:rPr>
+        <w:t>Acabal</w:t>
+      </w:r>
+      <w:proofErr w:type="spellEnd"/>
+      <w:r>
+        <w:rPr>
+          <w:sz w:val="28"/>
+        </w:rPr>
+        <w:t xml:space="preserve"> Hernández       7590-21-6522</w:t>
       </w:r>
     </w:p>
     <w:p/>
@@ -1268,8 +1323,13 @@
       </w:pPr>
       <w:r>
         <w:lastRenderedPageBreak/>
-        <w:t>PARTE B: Observabilidad</w:t>
-      </w:r>
+        <w:t xml:space="preserve">PARTE B: </w:t>
+      </w:r>
+      <w:proofErr w:type="spellStart"/>
+      <w:r>
+        <w:t>Observabilidad</w:t>
+      </w:r>
+      <w:proofErr w:type="spellEnd"/>
     </w:p>
     <w:p>
       <w:pPr>
@@ -1500,7 +1560,25 @@
                 <w:b/>
                 <w:bCs/>
               </w:rPr>
-              <w:t>p95 de Prometheus (ms)</w:t>
+              <w:t xml:space="preserve">p95 de </w:t>
+            </w:r>
+            <w:proofErr w:type="spellStart"/>
+            <w:r>
+              <w:rPr>
+                <w:rFonts w:ascii="Calibri" w:hAnsi="Calibri" w:cs="Calibri"/>
+                <w:b/>
+                <w:bCs/>
+              </w:rPr>
+              <w:t>Prometheus</w:t>
+            </w:r>
+            <w:proofErr w:type="spellEnd"/>
+            <w:r>
+              <w:rPr>
+                <w:rFonts w:ascii="Calibri" w:hAnsi="Calibri" w:cs="Calibri"/>
+                <w:b/>
+                <w:bCs/>
+              </w:rPr>
+              <w:t xml:space="preserve"> (ms)</w:t>
             </w:r>
           </w:p>
         </w:tc>
@@ -1734,7 +1812,21 @@
         <w:rPr>
           <w:rFonts w:ascii="Calibri" w:hAnsi="Calibri" w:cs="Calibri"/>
         </w:rPr>
-        <w:t>Valores a las 19:13:33, con la ventana de 30 s de cada panel. De base1 Prometheus no tiene serie, así que la tabla es de esta corrida.</w:t>
+        <w:t xml:space="preserve">Valores a las 19:13:33, con la ventana de 30 s de cada panel. De base1 </w:t>
+      </w:r>
+      <w:proofErr w:type="spellStart"/>
+      <w:r>
+        <w:rPr>
+          <w:rFonts w:ascii="Calibri" w:hAnsi="Calibri" w:cs="Calibri"/>
+        </w:rPr>
+        <w:t>Prometheus</w:t>
+      </w:r>
+      <w:proofErr w:type="spellEnd"/>
+      <w:r>
+        <w:rPr>
+          <w:rFonts w:ascii="Calibri" w:hAnsi="Calibri" w:cs="Calibri"/>
+        </w:rPr>
+        <w:t xml:space="preserve"> no tiene serie, así que la tabla es de esta corrida.</w:t>
       </w:r>
     </w:p>
     <w:tbl>
@@ -1798,21 +1890,29 @@
                 <w:b/>
                 <w:bCs/>
               </w:rPr>
-              <w:t>Valor a las 19:13:33</w:t>
-            </w:r>
-          </w:p>
-        </w:tc>
-        <w:tc>
-          <w:tcPr>
-            <w:tcW w:w="3126" w:type="dxa"/>
-          </w:tcPr>
-          <w:p>
+              <w:t xml:space="preserve">Valor a las </w:t>
+            </w:r>
             <w:r>
               <w:rPr>
                 <w:rFonts w:ascii="Calibri" w:hAnsi="Calibri" w:cs="Calibri"/>
                 <w:b/>
                 <w:bCs/>
               </w:rPr>
+              <w:t>19:13:33</w:t>
+            </w:r>
+          </w:p>
+        </w:tc>
+        <w:tc>
+          <w:tcPr>
+            <w:tcW w:w="3126" w:type="dxa"/>
+          </w:tcPr>
+          <w:p>
+            <w:r>
+              <w:rPr>
+                <w:rFonts w:ascii="Calibri" w:hAnsi="Calibri" w:cs="Calibri"/>
+                <w:b/>
+                <w:bCs/>
+              </w:rPr>
               <w:t>¿La responde?</w:t>
             </w:r>
           </w:p>
@@ -1921,7 +2021,13 @@
               <w:rPr>
                 <w:rFonts w:ascii="Calibri" w:hAnsi="Calibri" w:cs="Calibri"/>
               </w:rPr>
-              <w:t>Sí. api-2 y api-3 no están levantadas.</w:t>
+              <w:t>Sí. api-2 y api-3 no</w:t>
+            </w:r>
+            <w:r>
+              <w:rPr>
+                <w:rFonts w:ascii="Calibri" w:hAnsi="Calibri" w:cs="Calibri"/>
+              </w:rPr>
+              <w:t xml:space="preserve"> están levantadas.</w:t>
             </w:r>
           </w:p>
         </w:tc>
@@ -1976,7 +2082,43 @@
               <w:rPr>
                 <w:rFonts w:ascii="Calibri" w:hAnsi="Calibri" w:cs="Calibri"/>
               </w:rPr>
-              <w:t>No. El p95 de las solicitudes es 161.3 ms. Con una sola réplica el avg() no cambia el número. El error es el bucket de 0.1 a 0.5.</w:t>
+              <w:t xml:space="preserve">No. El p95 de las solicitudes es 161.3 ms. Con una sola réplica el </w:t>
+            </w:r>
+            <w:proofErr w:type="spellStart"/>
+            <w:proofErr w:type="gramStart"/>
+            <w:r>
+              <w:rPr>
+                <w:rFonts w:ascii="Calibri" w:hAnsi="Calibri" w:cs="Calibri"/>
+              </w:rPr>
+              <w:t>avg</w:t>
+            </w:r>
+            <w:proofErr w:type="spellEnd"/>
+            <w:r>
+              <w:rPr>
+                <w:rFonts w:ascii="Calibri" w:hAnsi="Calibri" w:cs="Calibri"/>
+              </w:rPr>
+              <w:t>(</w:t>
+            </w:r>
+            <w:proofErr w:type="gramEnd"/>
+            <w:r>
+              <w:rPr>
+                <w:rFonts w:ascii="Calibri" w:hAnsi="Calibri" w:cs="Calibri"/>
+              </w:rPr>
+              <w:t xml:space="preserve">) no cambia el número. El error es el </w:t>
+            </w:r>
+            <w:proofErr w:type="spellStart"/>
+            <w:r>
+              <w:rPr>
+                <w:rFonts w:ascii="Calibri" w:hAnsi="Calibri" w:cs="Calibri"/>
+              </w:rPr>
+              <w:t>bucket</w:t>
+            </w:r>
+            <w:proofErr w:type="spellEnd"/>
+            <w:r>
+              <w:rPr>
+                <w:rFonts w:ascii="Calibri" w:hAnsi="Calibri" w:cs="Calibri"/>
+              </w:rPr>
+              <w:t xml:space="preserve"> de 0.1 a 0.5.</w:t>
             </w:r>
           </w:p>
         </w:tc>
@@ -2030,7 +2172,27 @@
               <w:rPr>
                 <w:rFonts w:ascii="Calibri" w:hAnsi="Calibri" w:cs="Calibri"/>
               </w:rPr>
-              <w:t>El p50 se acerca a la mediana del CSV (99.1), pero interpola dentro de 0 a 100 ms y no incluye a Traefik. El p99 no: en el CSV es 173.0 y el panel dice 486.</w:t>
+              <w:t xml:space="preserve">El p50 </w:t>
+            </w:r>
+            <w:r>
+              <w:rPr>
+                <w:rFonts w:ascii="Calibri" w:hAnsi="Calibri" w:cs="Calibri"/>
+              </w:rPr>
+              <w:t xml:space="preserve">se acerca a la mediana del CSV (99.1), pero interpola dentro de 0 a 100 ms y no incluye a </w:t>
+            </w:r>
+            <w:proofErr w:type="spellStart"/>
+            <w:r>
+              <w:rPr>
+                <w:rFonts w:ascii="Calibri" w:hAnsi="Calibri" w:cs="Calibri"/>
+              </w:rPr>
+              <w:t>Traefik</w:t>
+            </w:r>
+            <w:proofErr w:type="spellEnd"/>
+            <w:r>
+              <w:rPr>
+                <w:rFonts w:ascii="Calibri" w:hAnsi="Calibri" w:cs="Calibri"/>
+              </w:rPr>
+              <w:t>. El p99 no: en el CSV es 173.0 y el panel dice 486.</w:t>
             </w:r>
           </w:p>
         </w:tc>
@@ -2084,7 +2246,13 @@
               <w:rPr>
                 <w:rFonts w:ascii="Calibri" w:hAnsi="Calibri" w:cs="Calibri"/>
               </w:rPr>
-              <w:t>No del todo. k6 falló 0 de 12280. Si no existe estado distinto de 201, el panel queda vacío, y vacío no es 0%.</w:t>
+              <w:t>No del todo. k6 falló 0 de 12280. Si no existe esta</w:t>
+            </w:r>
+            <w:r>
+              <w:rPr>
+                <w:rFonts w:ascii="Calibri" w:hAnsi="Calibri" w:cs="Calibri"/>
+              </w:rPr>
+              <w:t>do distinto de 201, el panel queda vacío, y vacío no es 0%.</w:t>
             </w:r>
           </w:p>
         </w:tc>
@@ -2095,11 +2263,19 @@
             <w:tcW w:w="1700" w:type="dxa"/>
           </w:tcPr>
           <w:p>
-            <w:r>
-              <w:rPr>
-                <w:rFonts w:ascii="Calibri" w:hAnsi="Calibri" w:cs="Calibri"/>
-              </w:rPr>
-              <w:t>Traefik por código</w:t>
+            <w:proofErr w:type="spellStart"/>
+            <w:r>
+              <w:rPr>
+                <w:rFonts w:ascii="Calibri" w:hAnsi="Calibri" w:cs="Calibri"/>
+              </w:rPr>
+              <w:t>Traefik</w:t>
+            </w:r>
+            <w:proofErr w:type="spellEnd"/>
+            <w:r>
+              <w:rPr>
+                <w:rFonts w:ascii="Calibri" w:hAnsi="Calibri" w:cs="Calibri"/>
+              </w:rPr>
+              <w:t xml:space="preserve"> por código</w:t>
             </w:r>
           </w:p>
         </w:tc>
@@ -2166,7 +2342,21 @@
               <w:rPr>
                 <w:rFonts w:ascii="Calibri" w:hAnsi="Calibri" w:cs="Calibri"/>
               </w:rPr>
-              <w:t>¿Cuáles reporta Prometheus?</w:t>
+              <w:t xml:space="preserve">¿Cuáles reporta </w:t>
+            </w:r>
+            <w:proofErr w:type="spellStart"/>
+            <w:r>
+              <w:rPr>
+                <w:rFonts w:ascii="Calibri" w:hAnsi="Calibri" w:cs="Calibri"/>
+              </w:rPr>
+              <w:t>Prometheus</w:t>
+            </w:r>
+            <w:proofErr w:type="spellEnd"/>
+            <w:r>
+              <w:rPr>
+                <w:rFonts w:ascii="Calibri" w:hAnsi="Calibri" w:cs="Calibri"/>
+              </w:rPr>
+              <w:t>?</w:t>
             </w:r>
           </w:p>
         </w:tc>
@@ -2192,20 +2382,2494 @@
               <w:rPr>
                 <w:rFonts w:ascii="Calibri" w:hAnsi="Calibri" w:cs="Calibri"/>
               </w:rPr>
-              <w:t>Sí. Solo api-1 está arriba.</w:t>
+              <w:t xml:space="preserve">Sí. </w:t>
+            </w:r>
+            <w:r>
+              <w:rPr>
+                <w:rFonts w:ascii="Calibri" w:hAnsi="Calibri" w:cs="Calibri"/>
+              </w:rPr>
+              <w:t>Solo api-1 está arriba.</w:t>
             </w:r>
           </w:p>
         </w:tc>
       </w:tr>
     </w:tbl>
     <w:p>
-      <w:r>
+      <w:pPr>
         <w:rPr>
           <w:rFonts w:ascii="Calibri" w:hAnsi="Calibri" w:cs="Calibri"/>
         </w:rPr>
-        <w:t>RED. R: lecturas por segundo, tráfico por réplica y Traefik por código. E: porcentaje de fallas, y el código de Traefik si saliera un 5xx. D: p50, p95 y p99.</w:t>
-      </w:r>
-    </w:p>
+      </w:pPr>
+      <w:r>
+        <w:rPr>
+          <w:rFonts w:ascii="Calibri" w:hAnsi="Calibri" w:cs="Calibri"/>
+        </w:rPr>
+        <w:t xml:space="preserve">RED. R: lecturas por segundo, tráfico por réplica y </w:t>
+      </w:r>
+      <w:proofErr w:type="spellStart"/>
+      <w:r>
+        <w:rPr>
+          <w:rFonts w:ascii="Calibri" w:hAnsi="Calibri" w:cs="Calibri"/>
+        </w:rPr>
+        <w:t>Traefik</w:t>
+      </w:r>
+      <w:proofErr w:type="spellEnd"/>
+      <w:r>
+        <w:rPr>
+          <w:rFonts w:ascii="Calibri" w:hAnsi="Calibri" w:cs="Calibri"/>
+        </w:rPr>
+        <w:t xml:space="preserve"> por código. E: porcentaje de fallas, y el código de </w:t>
+      </w:r>
+      <w:proofErr w:type="spellStart"/>
+      <w:r>
+        <w:rPr>
+          <w:rFonts w:ascii="Calibri" w:hAnsi="Calibri" w:cs="Calibri"/>
+        </w:rPr>
+        <w:t>Traefik</w:t>
+      </w:r>
+      <w:proofErr w:type="spellEnd"/>
+      <w:r>
+        <w:rPr>
+          <w:rFonts w:ascii="Calibri" w:hAnsi="Calibri" w:cs="Calibri"/>
+        </w:rPr>
+        <w:t xml:space="preserve"> si saliera un 5xx. D: p50, p95 y p99.</w:t>
+      </w:r>
+    </w:p>
+    <w:p>
+      <w:pPr>
+        <w:rPr>
+          <w:rFonts w:ascii="Calibri" w:hAnsi="Calibri" w:cs="Calibri"/>
+        </w:rPr>
+      </w:pPr>
+    </w:p>
+    <w:p>
+      <w:pPr>
+        <w:pStyle w:val="Ttulo1"/>
+      </w:pPr>
+      <w:r>
+        <w:t>PARTE C: Escalamiento horizontal</w:t>
+      </w:r>
+    </w:p>
+    <w:p>
+      <w:pPr>
+        <w:pStyle w:val="Ttulo1"/>
+      </w:pPr>
+      <w:r>
+        <w:t>Paso 8</w:t>
+      </w:r>
+    </w:p>
+    <w:p>
+      <w:r>
+        <w:rPr>
+          <w:rFonts w:ascii="Calibri" w:hAnsi="Calibri"/>
+        </w:rPr>
+        <w:t>La Parte C se ejecutó en la máquina de Cindy. Como base1 se midió en otra máquina, se repitió una prueba base con 1 réplica (base_cindy.csv) para que la comparación sea en el mismo ambiente.</w:t>
+      </w:r>
+    </w:p>
+    <w:p>
+      <w:pPr>
+        <w:pStyle w:val="Ttulo1"/>
+      </w:pPr>
+      <w:r>
+        <w:t>8.1</w:t>
+      </w:r>
+    </w:p>
+    <w:p>
+      <w:pPr>
+        <w:keepNext/>
+      </w:pPr>
+      <w:r>
+        <w:rPr>
+          <w:rFonts w:ascii="Calibri" w:hAnsi="Calibri"/>
+        </w:rPr>
+        <w:lastRenderedPageBreak/>
+        <w:t>Entorno de Python y carpeta de capturas.</w:t>
+      </w:r>
+    </w:p>
+    <w:p>
+      <w:r>
+        <w:rPr>
+          <w:noProof/>
+        </w:rPr>
+        <w:drawing>
+          <wp:inline distT="0" distB="0" distL="0" distR="0" wp14:anchorId="0B757F27" wp14:editId="359BAD85">
+            <wp:extent cx="5731510" cy="3167145"/>
+            <wp:effectExtent l="0" t="0" r="0" b="0"/>
+            <wp:docPr id="692567583" name="Picture 692567583"/>
+            <wp:cNvGraphicFramePr>
+              <a:graphicFrameLocks xmlns:a="http://schemas.openxmlformats.org/drawingml/2006/main" noChangeAspect="1"/>
+            </wp:cNvGraphicFramePr>
+            <a:graphic xmlns:a="http://schemas.openxmlformats.org/drawingml/2006/main">
+              <a:graphicData uri="http://schemas.openxmlformats.org/drawingml/2006/picture">
+                <pic:pic xmlns:pic="http://schemas.openxmlformats.org/drawingml/2006/picture">
+                  <pic:nvPicPr>
+                    <pic:cNvPr id="0" name="01_preparacion_entorno_python.png"/>
+                    <pic:cNvPicPr/>
+                  </pic:nvPicPr>
+                  <pic:blipFill>
+                    <a:blip r:embed="rId26"/>
+                    <a:stretch>
+                      <a:fillRect/>
+                    </a:stretch>
+                  </pic:blipFill>
+                  <pic:spPr>
+                    <a:xfrm>
+                      <a:off x="0" y="0"/>
+                      <a:ext cx="5731510" cy="3167145"/>
+                    </a:xfrm>
+                    <a:prstGeom prst="rect">
+                      <a:avLst/>
+                    </a:prstGeom>
+                  </pic:spPr>
+                </pic:pic>
+              </a:graphicData>
+            </a:graphic>
+          </wp:inline>
+        </w:drawing>
+      </w:r>
+    </w:p>
+    <w:p>
+      <w:pPr>
+        <w:keepNext/>
+      </w:pPr>
+      <w:r>
+        <w:rPr>
+          <w:rFonts w:ascii="Calibri" w:hAnsi="Calibri"/>
+        </w:rPr>
+        <w:t>Ambiente levantado con 1 sola réplica (</w:t>
+      </w:r>
+      <w:proofErr w:type="spellStart"/>
+      <w:r>
+        <w:rPr>
+          <w:rFonts w:ascii="Calibri" w:hAnsi="Calibri"/>
+        </w:rPr>
+        <w:t>docker</w:t>
+      </w:r>
+      <w:proofErr w:type="spellEnd"/>
+      <w:r>
+        <w:rPr>
+          <w:rFonts w:ascii="Calibri" w:hAnsi="Calibri"/>
+        </w:rPr>
+        <w:t xml:space="preserve"> </w:t>
+      </w:r>
+      <w:proofErr w:type="spellStart"/>
+      <w:r>
+        <w:rPr>
+          <w:rFonts w:ascii="Calibri" w:hAnsi="Calibri"/>
+        </w:rPr>
+        <w:t>compose</w:t>
+      </w:r>
+      <w:proofErr w:type="spellEnd"/>
+      <w:r>
+        <w:rPr>
+          <w:rFonts w:ascii="Calibri" w:hAnsi="Calibri"/>
+        </w:rPr>
+        <w:t xml:space="preserve"> up y </w:t>
+      </w:r>
+      <w:proofErr w:type="spellStart"/>
+      <w:r>
+        <w:rPr>
+          <w:rFonts w:ascii="Calibri" w:hAnsi="Calibri"/>
+        </w:rPr>
+        <w:t>ps</w:t>
+      </w:r>
+      <w:proofErr w:type="spellEnd"/>
+      <w:r>
+        <w:rPr>
+          <w:rFonts w:ascii="Calibri" w:hAnsi="Calibri"/>
+        </w:rPr>
+        <w:t>).</w:t>
+      </w:r>
+    </w:p>
+    <w:p>
+      <w:r>
+        <w:rPr>
+          <w:noProof/>
+        </w:rPr>
+        <w:drawing>
+          <wp:inline distT="0" distB="0" distL="0" distR="0" wp14:anchorId="305CA38E" wp14:editId="6CFB4910">
+            <wp:extent cx="5731510" cy="2416225"/>
+            <wp:effectExtent l="0" t="0" r="0" b="0"/>
+            <wp:docPr id="692567584" name="Picture 692567584"/>
+            <wp:cNvGraphicFramePr>
+              <a:graphicFrameLocks xmlns:a="http://schemas.openxmlformats.org/drawingml/2006/main" noChangeAspect="1"/>
+            </wp:cNvGraphicFramePr>
+            <a:graphic xmlns:a="http://schemas.openxmlformats.org/drawingml/2006/main">
+              <a:graphicData uri="http://schemas.openxmlformats.org/drawingml/2006/picture">
+                <pic:pic xmlns:pic="http://schemas.openxmlformats.org/drawingml/2006/picture">
+                  <pic:nvPicPr>
+                    <pic:cNvPr id="0" name="02_ambiente_1_replica.png"/>
+                    <pic:cNvPicPr/>
+                  </pic:nvPicPr>
+                  <pic:blipFill>
+                    <a:blip r:embed="rId27"/>
+                    <a:stretch>
+                      <a:fillRect/>
+                    </a:stretch>
+                  </pic:blipFill>
+                  <pic:spPr>
+                    <a:xfrm>
+                      <a:off x="0" y="0"/>
+                      <a:ext cx="5731510" cy="2416225"/>
+                    </a:xfrm>
+                    <a:prstGeom prst="rect">
+                      <a:avLst/>
+                    </a:prstGeom>
+                  </pic:spPr>
+                </pic:pic>
+              </a:graphicData>
+            </a:graphic>
+          </wp:inline>
+        </w:drawing>
+      </w:r>
+    </w:p>
+    <w:p>
+      <w:pPr>
+        <w:keepNext/>
+      </w:pPr>
+      <w:r>
+        <w:rPr>
+          <w:rFonts w:ascii="Calibri" w:hAnsi="Calibri"/>
+        </w:rPr>
+        <w:t xml:space="preserve">La API responde a través de </w:t>
+      </w:r>
+      <w:proofErr w:type="spellStart"/>
+      <w:r>
+        <w:rPr>
+          <w:rFonts w:ascii="Calibri" w:hAnsi="Calibri"/>
+        </w:rPr>
+        <w:t>Traefik</w:t>
+      </w:r>
+      <w:proofErr w:type="spellEnd"/>
+      <w:r>
+        <w:rPr>
+          <w:rFonts w:ascii="Calibri" w:hAnsi="Calibri"/>
+        </w:rPr>
+        <w:t>.</w:t>
+      </w:r>
+    </w:p>
+    <w:p>
+      <w:r>
+        <w:rPr>
+          <w:noProof/>
+        </w:rPr>
+        <w:drawing>
+          <wp:inline distT="0" distB="0" distL="0" distR="0" wp14:anchorId="7F2ED9C7" wp14:editId="4365A7F2">
+            <wp:extent cx="5731510" cy="610608"/>
+            <wp:effectExtent l="0" t="0" r="0" b="0"/>
+            <wp:docPr id="692567585" name="Picture 692567585"/>
+            <wp:cNvGraphicFramePr>
+              <a:graphicFrameLocks xmlns:a="http://schemas.openxmlformats.org/drawingml/2006/main" noChangeAspect="1"/>
+            </wp:cNvGraphicFramePr>
+            <a:graphic xmlns:a="http://schemas.openxmlformats.org/drawingml/2006/main">
+              <a:graphicData uri="http://schemas.openxmlformats.org/drawingml/2006/picture">
+                <pic:pic xmlns:pic="http://schemas.openxmlformats.org/drawingml/2006/picture">
+                  <pic:nvPicPr>
+                    <pic:cNvPr id="0" name="03_salud_1_replica.png"/>
+                    <pic:cNvPicPr/>
+                  </pic:nvPicPr>
+                  <pic:blipFill>
+                    <a:blip r:embed="rId28"/>
+                    <a:stretch>
+                      <a:fillRect/>
+                    </a:stretch>
+                  </pic:blipFill>
+                  <pic:spPr>
+                    <a:xfrm>
+                      <a:off x="0" y="0"/>
+                      <a:ext cx="5731510" cy="610608"/>
+                    </a:xfrm>
+                    <a:prstGeom prst="rect">
+                      <a:avLst/>
+                    </a:prstGeom>
+                  </pic:spPr>
+                </pic:pic>
+              </a:graphicData>
+            </a:graphic>
+          </wp:inline>
+        </w:drawing>
+      </w:r>
+    </w:p>
+    <w:p>
+      <w:pPr>
+        <w:keepNext/>
+      </w:pPr>
+      <w:r>
+        <w:rPr>
+          <w:rFonts w:ascii="Calibri" w:hAnsi="Calibri"/>
+        </w:rPr>
+        <w:lastRenderedPageBreak/>
+        <w:t xml:space="preserve">Prueba base con 1 réplica: </w:t>
+      </w:r>
+      <w:proofErr w:type="spellStart"/>
+      <w:r>
+        <w:rPr>
+          <w:rFonts w:ascii="Calibri" w:hAnsi="Calibri"/>
+        </w:rPr>
+        <w:t>python</w:t>
+      </w:r>
+      <w:proofErr w:type="spellEnd"/>
+      <w:r>
+        <w:rPr>
+          <w:rFonts w:ascii="Calibri" w:hAnsi="Calibri"/>
+        </w:rPr>
+        <w:t xml:space="preserve"> analizar.py resultados/base_cindy.csv. </w:t>
+      </w:r>
+      <w:proofErr w:type="spellStart"/>
+      <w:r>
+        <w:rPr>
+          <w:rFonts w:ascii="Calibri" w:hAnsi="Calibri"/>
+        </w:rPr>
+        <w:t>Throughput</w:t>
+      </w:r>
+      <w:proofErr w:type="spellEnd"/>
+      <w:r>
+        <w:rPr>
+          <w:rFonts w:ascii="Calibri" w:hAnsi="Calibri"/>
+        </w:rPr>
+        <w:t xml:space="preserve"> 33.99/s, p50 289.0 ms, p99 696.1 ms.</w:t>
+      </w:r>
+    </w:p>
+    <w:p>
+      <w:r>
+        <w:rPr>
+          <w:noProof/>
+        </w:rPr>
+        <w:drawing>
+          <wp:inline distT="0" distB="0" distL="0" distR="0" wp14:anchorId="2DE8C41C" wp14:editId="55B82DCD">
+            <wp:extent cx="5731510" cy="2441902"/>
+            <wp:effectExtent l="0" t="0" r="0" b="0"/>
+            <wp:docPr id="692567586" name="Picture 692567586"/>
+            <wp:cNvGraphicFramePr>
+              <a:graphicFrameLocks xmlns:a="http://schemas.openxmlformats.org/drawingml/2006/main" noChangeAspect="1"/>
+            </wp:cNvGraphicFramePr>
+            <a:graphic xmlns:a="http://schemas.openxmlformats.org/drawingml/2006/main">
+              <a:graphicData uri="http://schemas.openxmlformats.org/drawingml/2006/picture">
+                <pic:pic xmlns:pic="http://schemas.openxmlformats.org/drawingml/2006/picture">
+                  <pic:nvPicPr>
+                    <pic:cNvPr id="0" name="C1_analizar_base_cindy.png"/>
+                    <pic:cNvPicPr/>
+                  </pic:nvPicPr>
+                  <pic:blipFill>
+                    <a:blip r:embed="rId29"/>
+                    <a:stretch>
+                      <a:fillRect/>
+                    </a:stretch>
+                  </pic:blipFill>
+                  <pic:spPr>
+                    <a:xfrm>
+                      <a:off x="0" y="0"/>
+                      <a:ext cx="5731510" cy="2441902"/>
+                    </a:xfrm>
+                    <a:prstGeom prst="rect">
+                      <a:avLst/>
+                    </a:prstGeom>
+                  </pic:spPr>
+                </pic:pic>
+              </a:graphicData>
+            </a:graphic>
+          </wp:inline>
+        </w:drawing>
+      </w:r>
+    </w:p>
+    <w:p>
+      <w:pPr>
+        <w:keepNext/>
+      </w:pPr>
+      <w:r>
+        <w:rPr>
+          <w:rFonts w:ascii="Calibri" w:hAnsi="Calibri"/>
+        </w:rPr>
+        <w:t xml:space="preserve">Horas de la corrida </w:t>
+      </w:r>
+      <w:proofErr w:type="spellStart"/>
+      <w:r>
+        <w:rPr>
+          <w:rFonts w:ascii="Calibri" w:hAnsi="Calibri"/>
+        </w:rPr>
+        <w:t>base_cindy</w:t>
+      </w:r>
+      <w:proofErr w:type="spellEnd"/>
+      <w:r>
+        <w:rPr>
+          <w:rFonts w:ascii="Calibri" w:hAnsi="Calibri"/>
+        </w:rPr>
+        <w:t>, recuperadas del CSV: 20:26:24 a 20:28:24.</w:t>
+      </w:r>
+    </w:p>
+    <w:p>
+      <w:r>
+        <w:rPr>
+          <w:noProof/>
+        </w:rPr>
+        <w:drawing>
+          <wp:inline distT="0" distB="0" distL="0" distR="0" wp14:anchorId="15C20431" wp14:editId="4F2782CC">
+            <wp:extent cx="5731510" cy="736002"/>
+            <wp:effectExtent l="0" t="0" r="0" b="0"/>
+            <wp:docPr id="692567587" name="Picture 692567587"/>
+            <wp:cNvGraphicFramePr>
+              <a:graphicFrameLocks xmlns:a="http://schemas.openxmlformats.org/drawingml/2006/main" noChangeAspect="1"/>
+            </wp:cNvGraphicFramePr>
+            <a:graphic xmlns:a="http://schemas.openxmlformats.org/drawingml/2006/main">
+              <a:graphicData uri="http://schemas.openxmlformats.org/drawingml/2006/picture">
+                <pic:pic xmlns:pic="http://schemas.openxmlformats.org/drawingml/2006/picture">
+                  <pic:nvPicPr>
+                    <pic:cNvPr id="0" name="C1b_horas_base_cindy.png"/>
+                    <pic:cNvPicPr/>
+                  </pic:nvPicPr>
+                  <pic:blipFill>
+                    <a:blip r:embed="rId30"/>
+                    <a:stretch>
+                      <a:fillRect/>
+                    </a:stretch>
+                  </pic:blipFill>
+                  <pic:spPr>
+                    <a:xfrm>
+                      <a:off x="0" y="0"/>
+                      <a:ext cx="5731510" cy="736002"/>
+                    </a:xfrm>
+                    <a:prstGeom prst="rect">
+                      <a:avLst/>
+                    </a:prstGeom>
+                  </pic:spPr>
+                </pic:pic>
+              </a:graphicData>
+            </a:graphic>
+          </wp:inline>
+        </w:drawing>
+      </w:r>
+    </w:p>
+    <w:p>
+      <w:pPr>
+        <w:keepNext/>
+      </w:pPr>
+      <w:r>
+        <w:rPr>
+          <w:rFonts w:ascii="Calibri" w:hAnsi="Calibri"/>
+        </w:rPr>
+        <w:t>Predicción escrita antes de escalar (prediccion.md).</w:t>
+      </w:r>
+    </w:p>
+    <w:p>
+      <w:r>
+        <w:rPr>
+          <w:noProof/>
+        </w:rPr>
+        <w:drawing>
+          <wp:inline distT="0" distB="0" distL="0" distR="0" wp14:anchorId="39D1B263" wp14:editId="3CB5577B">
+            <wp:extent cx="5731510" cy="1522498"/>
+            <wp:effectExtent l="0" t="0" r="0" b="0"/>
+            <wp:docPr id="692567588" name="Picture 692567588"/>
+            <wp:cNvGraphicFramePr>
+              <a:graphicFrameLocks xmlns:a="http://schemas.openxmlformats.org/drawingml/2006/main" noChangeAspect="1"/>
+            </wp:cNvGraphicFramePr>
+            <a:graphic xmlns:a="http://schemas.openxmlformats.org/drawingml/2006/main">
+              <a:graphicData uri="http://schemas.openxmlformats.org/drawingml/2006/picture">
+                <pic:pic xmlns:pic="http://schemas.openxmlformats.org/drawingml/2006/picture">
+                  <pic:nvPicPr>
+                    <pic:cNvPr id="0" name="C0b_prediccion_md.png"/>
+                    <pic:cNvPicPr/>
+                  </pic:nvPicPr>
+                  <pic:blipFill>
+                    <a:blip r:embed="rId31"/>
+                    <a:stretch>
+                      <a:fillRect/>
+                    </a:stretch>
+                  </pic:blipFill>
+                  <pic:spPr>
+                    <a:xfrm>
+                      <a:off x="0" y="0"/>
+                      <a:ext cx="5731510" cy="1522498"/>
+                    </a:xfrm>
+                    <a:prstGeom prst="rect">
+                      <a:avLst/>
+                    </a:prstGeom>
+                  </pic:spPr>
+                </pic:pic>
+              </a:graphicData>
+            </a:graphic>
+          </wp:inline>
+        </w:drawing>
+      </w:r>
+    </w:p>
+    <w:p>
+      <w:pPr>
+        <w:keepNext/>
+      </w:pPr>
+      <w:r>
+        <w:rPr>
+          <w:rFonts w:ascii="Calibri" w:hAnsi="Calibri"/>
+        </w:rPr>
+        <w:t>Base registrada en respuestas.md.</w:t>
+      </w:r>
+    </w:p>
+    <w:p>
+      <w:r>
+        <w:rPr>
+          <w:noProof/>
+        </w:rPr>
+        <w:drawing>
+          <wp:inline distT="0" distB="0" distL="0" distR="0" wp14:anchorId="13E9E985" wp14:editId="0FB05302">
+            <wp:extent cx="5731510" cy="1897111"/>
+            <wp:effectExtent l="0" t="0" r="0" b="0"/>
+            <wp:docPr id="692567589" name="Picture 692567589"/>
+            <wp:cNvGraphicFramePr>
+              <a:graphicFrameLocks xmlns:a="http://schemas.openxmlformats.org/drawingml/2006/main" noChangeAspect="1"/>
+            </wp:cNvGraphicFramePr>
+            <a:graphic xmlns:a="http://schemas.openxmlformats.org/drawingml/2006/main">
+              <a:graphicData uri="http://schemas.openxmlformats.org/drawingml/2006/picture">
+                <pic:pic xmlns:pic="http://schemas.openxmlformats.org/drawingml/2006/picture">
+                  <pic:nvPicPr>
+                    <pic:cNvPr id="0" name="C0c_respuestas_base_cindy.png"/>
+                    <pic:cNvPicPr/>
+                  </pic:nvPicPr>
+                  <pic:blipFill>
+                    <a:blip r:embed="rId32"/>
+                    <a:stretch>
+                      <a:fillRect/>
+                    </a:stretch>
+                  </pic:blipFill>
+                  <pic:spPr>
+                    <a:xfrm>
+                      <a:off x="0" y="0"/>
+                      <a:ext cx="5731510" cy="1897111"/>
+                    </a:xfrm>
+                    <a:prstGeom prst="rect">
+                      <a:avLst/>
+                    </a:prstGeom>
+                  </pic:spPr>
+                </pic:pic>
+              </a:graphicData>
+            </a:graphic>
+          </wp:inline>
+        </w:drawing>
+      </w:r>
+    </w:p>
+    <w:p>
+      <w:pPr>
+        <w:keepNext/>
+      </w:pPr>
+      <w:proofErr w:type="spellStart"/>
+      <w:r>
+        <w:rPr>
+          <w:rFonts w:ascii="Calibri" w:hAnsi="Calibri"/>
+        </w:rPr>
+        <w:lastRenderedPageBreak/>
+        <w:t>Commit</w:t>
+      </w:r>
+      <w:proofErr w:type="spellEnd"/>
+      <w:r>
+        <w:rPr>
+          <w:rFonts w:ascii="Calibri" w:hAnsi="Calibri"/>
+        </w:rPr>
+        <w:t xml:space="preserve"> de la predicción (2cf2cd4), hecho antes de levantar api-2 y api-3.</w:t>
+      </w:r>
+    </w:p>
+    <w:p>
+      <w:r>
+        <w:rPr>
+          <w:noProof/>
+        </w:rPr>
+        <w:drawing>
+          <wp:inline distT="0" distB="0" distL="0" distR="0" wp14:anchorId="7A6D3656" wp14:editId="4ACA6D70">
+            <wp:extent cx="5731510" cy="827173"/>
+            <wp:effectExtent l="0" t="0" r="0" b="0"/>
+            <wp:docPr id="692567590" name="Picture 692567590"/>
+            <wp:cNvGraphicFramePr>
+              <a:graphicFrameLocks xmlns:a="http://schemas.openxmlformats.org/drawingml/2006/main" noChangeAspect="1"/>
+            </wp:cNvGraphicFramePr>
+            <a:graphic xmlns:a="http://schemas.openxmlformats.org/drawingml/2006/main">
+              <a:graphicData uri="http://schemas.openxmlformats.org/drawingml/2006/picture">
+                <pic:pic xmlns:pic="http://schemas.openxmlformats.org/drawingml/2006/picture">
+                  <pic:nvPicPr>
+                    <pic:cNvPr id="0" name="C0_commit_prediccion.png"/>
+                    <pic:cNvPicPr/>
+                  </pic:nvPicPr>
+                  <pic:blipFill>
+                    <a:blip r:embed="rId33"/>
+                    <a:stretch>
+                      <a:fillRect/>
+                    </a:stretch>
+                  </pic:blipFill>
+                  <pic:spPr>
+                    <a:xfrm>
+                      <a:off x="0" y="0"/>
+                      <a:ext cx="5731510" cy="827173"/>
+                    </a:xfrm>
+                    <a:prstGeom prst="rect">
+                      <a:avLst/>
+                    </a:prstGeom>
+                  </pic:spPr>
+                </pic:pic>
+              </a:graphicData>
+            </a:graphic>
+          </wp:inline>
+        </w:drawing>
+      </w:r>
+    </w:p>
+    <w:p>
+      <w:pPr>
+        <w:pStyle w:val="Ttulo1"/>
+      </w:pPr>
+      <w:r>
+        <w:t>8.2</w:t>
+      </w:r>
+    </w:p>
+    <w:p>
+      <w:pPr>
+        <w:keepNext/>
+      </w:pPr>
+      <w:r>
+        <w:rPr>
+          <w:rFonts w:ascii="Calibri" w:hAnsi="Calibri"/>
+        </w:rPr>
+        <w:t>Réplicas levantadas y reparto de /salud: api-1, api-2 y api-3 atienden 2 de 6 cada una.</w:t>
+      </w:r>
+    </w:p>
+    <w:p>
+      <w:r>
+        <w:rPr>
+          <w:noProof/>
+        </w:rPr>
+        <w:drawing>
+          <wp:inline distT="0" distB="0" distL="0" distR="0" wp14:anchorId="52D5469D" wp14:editId="5B02E893">
+            <wp:extent cx="5731510" cy="1995944"/>
+            <wp:effectExtent l="0" t="0" r="0" b="0"/>
+            <wp:docPr id="692567591" name="Picture 692567591"/>
+            <wp:cNvGraphicFramePr>
+              <a:graphicFrameLocks xmlns:a="http://schemas.openxmlformats.org/drawingml/2006/main" noChangeAspect="1"/>
+            </wp:cNvGraphicFramePr>
+            <a:graphic xmlns:a="http://schemas.openxmlformats.org/drawingml/2006/main">
+              <a:graphicData uri="http://schemas.openxmlformats.org/drawingml/2006/picture">
+                <pic:pic xmlns:pic="http://schemas.openxmlformats.org/drawingml/2006/picture">
+                  <pic:nvPicPr>
+                    <pic:cNvPr id="0" name="C2_salud_reparto_3_replicas.png"/>
+                    <pic:cNvPicPr/>
+                  </pic:nvPicPr>
+                  <pic:blipFill>
+                    <a:blip r:embed="rId34"/>
+                    <a:stretch>
+                      <a:fillRect/>
+                    </a:stretch>
+                  </pic:blipFill>
+                  <pic:spPr>
+                    <a:xfrm>
+                      <a:off x="0" y="0"/>
+                      <a:ext cx="5731510" cy="1995944"/>
+                    </a:xfrm>
+                    <a:prstGeom prst="rect">
+                      <a:avLst/>
+                    </a:prstGeom>
+                  </pic:spPr>
+                </pic:pic>
+              </a:graphicData>
+            </a:graphic>
+          </wp:inline>
+        </w:drawing>
+      </w:r>
+    </w:p>
+    <w:p>
+      <w:pPr>
+        <w:keepNext/>
+      </w:pPr>
+      <w:proofErr w:type="spellStart"/>
+      <w:r>
+        <w:rPr>
+          <w:rFonts w:ascii="Calibri" w:hAnsi="Calibri"/>
+        </w:rPr>
+        <w:t>Traefik</w:t>
+      </w:r>
+      <w:proofErr w:type="spellEnd"/>
+      <w:r>
+        <w:rPr>
+          <w:rFonts w:ascii="Calibri" w:hAnsi="Calibri"/>
+        </w:rPr>
+        <w:t xml:space="preserve"> con 3 servidores en UP, todos con peso 1 (reparto parejo).</w:t>
+      </w:r>
+    </w:p>
+    <w:p>
+      <w:r>
+        <w:rPr>
+          <w:noProof/>
+        </w:rPr>
+        <w:drawing>
+          <wp:inline distT="0" distB="0" distL="0" distR="0" wp14:anchorId="19A12CB1" wp14:editId="573C3B3F">
+            <wp:extent cx="5731510" cy="2567239"/>
+            <wp:effectExtent l="0" t="0" r="0" b="0"/>
+            <wp:docPr id="692567592" name="Picture 692567592"/>
+            <wp:cNvGraphicFramePr>
+              <a:graphicFrameLocks xmlns:a="http://schemas.openxmlformats.org/drawingml/2006/main" noChangeAspect="1"/>
+            </wp:cNvGraphicFramePr>
+            <a:graphic xmlns:a="http://schemas.openxmlformats.org/drawingml/2006/main">
+              <a:graphicData uri="http://schemas.openxmlformats.org/drawingml/2006/picture">
+                <pic:pic xmlns:pic="http://schemas.openxmlformats.org/drawingml/2006/picture">
+                  <pic:nvPicPr>
+                    <pic:cNvPr id="0" name="C3_traefik_3_servidores.png"/>
+                    <pic:cNvPicPr/>
+                  </pic:nvPicPr>
+                  <pic:blipFill>
+                    <a:blip r:embed="rId35"/>
+                    <a:stretch>
+                      <a:fillRect/>
+                    </a:stretch>
+                  </pic:blipFill>
+                  <pic:spPr>
+                    <a:xfrm>
+                      <a:off x="0" y="0"/>
+                      <a:ext cx="5731510" cy="2567239"/>
+                    </a:xfrm>
+                    <a:prstGeom prst="rect">
+                      <a:avLst/>
+                    </a:prstGeom>
+                  </pic:spPr>
+                </pic:pic>
+              </a:graphicData>
+            </a:graphic>
+          </wp:inline>
+        </w:drawing>
+      </w:r>
+    </w:p>
+    <w:p>
+      <w:pPr>
+        <w:keepNext/>
+      </w:pPr>
+      <w:proofErr w:type="spellStart"/>
+      <w:r>
+        <w:rPr>
+          <w:rFonts w:ascii="Calibri" w:hAnsi="Calibri"/>
+        </w:rPr>
+        <w:lastRenderedPageBreak/>
+        <w:t>Prometheus</w:t>
+      </w:r>
+      <w:proofErr w:type="spellEnd"/>
+      <w:r>
+        <w:rPr>
+          <w:rFonts w:ascii="Calibri" w:hAnsi="Calibri"/>
+        </w:rPr>
+        <w:t xml:space="preserve"> con los 3 objetivos de la API en UP.</w:t>
+      </w:r>
+    </w:p>
+    <w:p>
+      <w:r>
+        <w:rPr>
+          <w:noProof/>
+        </w:rPr>
+        <w:drawing>
+          <wp:inline distT="0" distB="0" distL="0" distR="0" wp14:anchorId="3CB9BB86" wp14:editId="3C5BE324">
+            <wp:extent cx="5731510" cy="2485345"/>
+            <wp:effectExtent l="0" t="0" r="0" b="0"/>
+            <wp:docPr id="692567593" name="Picture 692567593"/>
+            <wp:cNvGraphicFramePr>
+              <a:graphicFrameLocks xmlns:a="http://schemas.openxmlformats.org/drawingml/2006/main" noChangeAspect="1"/>
+            </wp:cNvGraphicFramePr>
+            <a:graphic xmlns:a="http://schemas.openxmlformats.org/drawingml/2006/main">
+              <a:graphicData uri="http://schemas.openxmlformats.org/drawingml/2006/picture">
+                <pic:pic xmlns:pic="http://schemas.openxmlformats.org/drawingml/2006/picture">
+                  <pic:nvPicPr>
+                    <pic:cNvPr id="0" name="C4_prometheus_targets_3_up.png"/>
+                    <pic:cNvPicPr/>
+                  </pic:nvPicPr>
+                  <pic:blipFill>
+                    <a:blip r:embed="rId36"/>
+                    <a:stretch>
+                      <a:fillRect/>
+                    </a:stretch>
+                  </pic:blipFill>
+                  <pic:spPr>
+                    <a:xfrm>
+                      <a:off x="0" y="0"/>
+                      <a:ext cx="5731510" cy="2485345"/>
+                    </a:xfrm>
+                    <a:prstGeom prst="rect">
+                      <a:avLst/>
+                    </a:prstGeom>
+                  </pic:spPr>
+                </pic:pic>
+              </a:graphicData>
+            </a:graphic>
+          </wp:inline>
+        </w:drawing>
+      </w:r>
+    </w:p>
+    <w:p>
+      <w:pPr>
+        <w:pStyle w:val="Ttulo1"/>
+      </w:pPr>
+      <w:r>
+        <w:t>8.3</w:t>
+      </w:r>
+    </w:p>
+    <w:p>
+      <w:pPr>
+        <w:keepNext/>
+      </w:pPr>
+      <w:r>
+        <w:rPr>
+          <w:rFonts w:ascii="Calibri" w:hAnsi="Calibri"/>
+        </w:rPr>
+        <w:t>Resumen de k6 de la prueba escalado: 5951 solicitudes, 0 fallidas.</w:t>
+      </w:r>
+    </w:p>
+    <w:p>
+      <w:r>
+        <w:rPr>
+          <w:noProof/>
+        </w:rPr>
+        <w:drawing>
+          <wp:inline distT="0" distB="0" distL="0" distR="0" wp14:anchorId="2C259F4A" wp14:editId="3A5CB11A">
+            <wp:extent cx="5731510" cy="2687301"/>
+            <wp:effectExtent l="0" t="0" r="0" b="0"/>
+            <wp:docPr id="692567594" name="Picture 692567594"/>
+            <wp:cNvGraphicFramePr>
+              <a:graphicFrameLocks xmlns:a="http://schemas.openxmlformats.org/drawingml/2006/main" noChangeAspect="1"/>
+            </wp:cNvGraphicFramePr>
+            <a:graphic xmlns:a="http://schemas.openxmlformats.org/drawingml/2006/main">
+              <a:graphicData uri="http://schemas.openxmlformats.org/drawingml/2006/picture">
+                <pic:pic xmlns:pic="http://schemas.openxmlformats.org/drawingml/2006/picture">
+                  <pic:nvPicPr>
+                    <pic:cNvPr id="0" name="C6_k6_resumen_escalado.png"/>
+                    <pic:cNvPicPr/>
+                  </pic:nvPicPr>
+                  <pic:blipFill>
+                    <a:blip r:embed="rId37"/>
+                    <a:stretch>
+                      <a:fillRect/>
+                    </a:stretch>
+                  </pic:blipFill>
+                  <pic:spPr>
+                    <a:xfrm>
+                      <a:off x="0" y="0"/>
+                      <a:ext cx="5731510" cy="2687301"/>
+                    </a:xfrm>
+                    <a:prstGeom prst="rect">
+                      <a:avLst/>
+                    </a:prstGeom>
+                  </pic:spPr>
+                </pic:pic>
+              </a:graphicData>
+            </a:graphic>
+          </wp:inline>
+        </w:drawing>
+      </w:r>
+    </w:p>
+    <w:p>
+      <w:pPr>
+        <w:keepNext/>
+      </w:pPr>
+      <w:proofErr w:type="spellStart"/>
+      <w:r>
+        <w:rPr>
+          <w:rFonts w:ascii="Calibri" w:hAnsi="Calibri"/>
+        </w:rPr>
+        <w:t>docker</w:t>
+      </w:r>
+      <w:proofErr w:type="spellEnd"/>
+      <w:r>
+        <w:rPr>
+          <w:rFonts w:ascii="Calibri" w:hAnsi="Calibri"/>
+        </w:rPr>
+        <w:t xml:space="preserve"> </w:t>
+      </w:r>
+      <w:proofErr w:type="spellStart"/>
+      <w:r>
+        <w:rPr>
+          <w:rFonts w:ascii="Calibri" w:hAnsi="Calibri"/>
+        </w:rPr>
+        <w:t>stats</w:t>
+      </w:r>
+      <w:proofErr w:type="spellEnd"/>
+      <w:r>
+        <w:rPr>
+          <w:rFonts w:ascii="Calibri" w:hAnsi="Calibri"/>
+        </w:rPr>
+        <w:t xml:space="preserve"> durante la carga: api-3 al 25.58 % (tope de su límite de 0.25), api-1 24.96 % y api-2 22.99 % (mitad de su límite de 0.5), PostgreSQL 5.82 %.</w:t>
+      </w:r>
+    </w:p>
+    <w:p>
+      <w:r>
+        <w:rPr>
+          <w:noProof/>
+        </w:rPr>
+        <w:drawing>
+          <wp:inline distT="0" distB="0" distL="0" distR="0" wp14:anchorId="1102F669" wp14:editId="39B3C3F5">
+            <wp:extent cx="5731510" cy="1130548"/>
+            <wp:effectExtent l="0" t="0" r="0" b="0"/>
+            <wp:docPr id="692567595" name="Picture 692567595"/>
+            <wp:cNvGraphicFramePr>
+              <a:graphicFrameLocks xmlns:a="http://schemas.openxmlformats.org/drawingml/2006/main" noChangeAspect="1"/>
+            </wp:cNvGraphicFramePr>
+            <a:graphic xmlns:a="http://schemas.openxmlformats.org/drawingml/2006/main">
+              <a:graphicData uri="http://schemas.openxmlformats.org/drawingml/2006/picture">
+                <pic:pic xmlns:pic="http://schemas.openxmlformats.org/drawingml/2006/picture">
+                  <pic:nvPicPr>
+                    <pic:cNvPr id="0" name="C5_docker_stats_escalado.png"/>
+                    <pic:cNvPicPr/>
+                  </pic:nvPicPr>
+                  <pic:blipFill>
+                    <a:blip r:embed="rId38"/>
+                    <a:stretch>
+                      <a:fillRect/>
+                    </a:stretch>
+                  </pic:blipFill>
+                  <pic:spPr>
+                    <a:xfrm>
+                      <a:off x="0" y="0"/>
+                      <a:ext cx="5731510" cy="1130548"/>
+                    </a:xfrm>
+                    <a:prstGeom prst="rect">
+                      <a:avLst/>
+                    </a:prstGeom>
+                  </pic:spPr>
+                </pic:pic>
+              </a:graphicData>
+            </a:graphic>
+          </wp:inline>
+        </w:drawing>
+      </w:r>
+    </w:p>
+    <w:p>
+      <w:pPr>
+        <w:keepNext/>
+      </w:pPr>
+      <w:proofErr w:type="spellStart"/>
+      <w:r>
+        <w:rPr>
+          <w:rFonts w:ascii="Calibri" w:hAnsi="Calibri"/>
+        </w:rPr>
+        <w:lastRenderedPageBreak/>
+        <w:t>python</w:t>
+      </w:r>
+      <w:proofErr w:type="spellEnd"/>
+      <w:r>
+        <w:rPr>
+          <w:rFonts w:ascii="Calibri" w:hAnsi="Calibri"/>
+        </w:rPr>
+        <w:t xml:space="preserve"> analizar.py resultados/escalado.csv: </w:t>
+      </w:r>
+      <w:proofErr w:type="spellStart"/>
+      <w:r>
+        <w:rPr>
+          <w:rFonts w:ascii="Calibri" w:hAnsi="Calibri"/>
+        </w:rPr>
+        <w:t>throughput</w:t>
+      </w:r>
+      <w:proofErr w:type="spellEnd"/>
+      <w:r>
+        <w:rPr>
+          <w:rFonts w:ascii="Calibri" w:hAnsi="Calibri"/>
+        </w:rPr>
+        <w:t xml:space="preserve"> 49.18/s, p50 23.8 ms, p95 701.3 ms, p99 1096.0 ms.</w:t>
+      </w:r>
+    </w:p>
+    <w:p>
+      <w:r>
+        <w:rPr>
+          <w:noProof/>
+        </w:rPr>
+        <w:drawing>
+          <wp:inline distT="0" distB="0" distL="0" distR="0" wp14:anchorId="40714F1E" wp14:editId="55F505D1">
+            <wp:extent cx="5731510" cy="1966653"/>
+            <wp:effectExtent l="0" t="0" r="0" b="0"/>
+            <wp:docPr id="692567596" name="Picture 692567596"/>
+            <wp:cNvGraphicFramePr>
+              <a:graphicFrameLocks xmlns:a="http://schemas.openxmlformats.org/drawingml/2006/main" noChangeAspect="1"/>
+            </wp:cNvGraphicFramePr>
+            <a:graphic xmlns:a="http://schemas.openxmlformats.org/drawingml/2006/main">
+              <a:graphicData uri="http://schemas.openxmlformats.org/drawingml/2006/picture">
+                <pic:pic xmlns:pic="http://schemas.openxmlformats.org/drawingml/2006/picture">
+                  <pic:nvPicPr>
+                    <pic:cNvPr id="0" name="C7_analizar_escalado.png"/>
+                    <pic:cNvPicPr/>
+                  </pic:nvPicPr>
+                  <pic:blipFill>
+                    <a:blip r:embed="rId39"/>
+                    <a:stretch>
+                      <a:fillRect/>
+                    </a:stretch>
+                  </pic:blipFill>
+                  <pic:spPr>
+                    <a:xfrm>
+                      <a:off x="0" y="0"/>
+                      <a:ext cx="5731510" cy="1966653"/>
+                    </a:xfrm>
+                    <a:prstGeom prst="rect">
+                      <a:avLst/>
+                    </a:prstGeom>
+                  </pic:spPr>
+                </pic:pic>
+              </a:graphicData>
+            </a:graphic>
+          </wp:inline>
+        </w:drawing>
+      </w:r>
+    </w:p>
+    <w:p>
+      <w:pPr>
+        <w:keepNext/>
+      </w:pPr>
+      <w:r>
+        <w:rPr>
+          <w:rFonts w:ascii="Calibri" w:hAnsi="Calibri"/>
+        </w:rPr>
+        <w:t>Horas de la corrida escalado: 20:49:41 a 20:51:41.</w:t>
+      </w:r>
+    </w:p>
+    <w:p>
+      <w:r>
+        <w:rPr>
+          <w:noProof/>
+        </w:rPr>
+        <w:drawing>
+          <wp:inline distT="0" distB="0" distL="0" distR="0" wp14:anchorId="33ED0D8D" wp14:editId="282D9FE8">
+            <wp:extent cx="5731510" cy="953152"/>
+            <wp:effectExtent l="0" t="0" r="0" b="0"/>
+            <wp:docPr id="692567597" name="Picture 692567597"/>
+            <wp:cNvGraphicFramePr>
+              <a:graphicFrameLocks xmlns:a="http://schemas.openxmlformats.org/drawingml/2006/main" noChangeAspect="1"/>
+            </wp:cNvGraphicFramePr>
+            <a:graphic xmlns:a="http://schemas.openxmlformats.org/drawingml/2006/main">
+              <a:graphicData uri="http://schemas.openxmlformats.org/drawingml/2006/picture">
+                <pic:pic xmlns:pic="http://schemas.openxmlformats.org/drawingml/2006/picture">
+                  <pic:nvPicPr>
+                    <pic:cNvPr id="0" name="C7b_horas_escalado.png"/>
+                    <pic:cNvPicPr/>
+                  </pic:nvPicPr>
+                  <pic:blipFill>
+                    <a:blip r:embed="rId40"/>
+                    <a:stretch>
+                      <a:fillRect/>
+                    </a:stretch>
+                  </pic:blipFill>
+                  <pic:spPr>
+                    <a:xfrm>
+                      <a:off x="0" y="0"/>
+                      <a:ext cx="5731510" cy="953152"/>
+                    </a:xfrm>
+                    <a:prstGeom prst="rect">
+                      <a:avLst/>
+                    </a:prstGeom>
+                  </pic:spPr>
+                </pic:pic>
+              </a:graphicData>
+            </a:graphic>
+          </wp:inline>
+        </w:drawing>
+      </w:r>
+    </w:p>
+    <w:p>
+      <w:pPr>
+        <w:pStyle w:val="Ttulo1"/>
+      </w:pPr>
+      <w:r>
+        <w:t>8.4</w:t>
+      </w:r>
+    </w:p>
+    <w:p>
+      <w:r>
+        <w:rPr>
+          <w:rFonts w:ascii="Calibri" w:hAnsi="Calibri"/>
+        </w:rPr>
+        <w:t>Fuentes: analizar.py sobre base_cindy.csv y escalado.csv.</w:t>
+      </w:r>
+    </w:p>
+    <w:tbl>
+      <w:tblPr>
+        <w:tblW w:w="9026" w:type="dxa"/>
+        <w:tblBorders>
+          <w:top w:val="single" w:sz="4" w:space="0" w:color="000000"/>
+          <w:left w:val="single" w:sz="4" w:space="0" w:color="000000"/>
+          <w:bottom w:val="single" w:sz="4" w:space="0" w:color="000000"/>
+          <w:right w:val="single" w:sz="4" w:space="0" w:color="000000"/>
+          <w:insideH w:val="single" w:sz="4" w:space="0" w:color="000000"/>
+          <w:insideV w:val="single" w:sz="4" w:space="0" w:color="000000"/>
+        </w:tblBorders>
+        <w:tblLook w:val="04A0" w:firstRow="1" w:lastRow="0" w:firstColumn="1" w:lastColumn="0" w:noHBand="0" w:noVBand="1"/>
+      </w:tblPr>
+      <w:tblGrid>
+        <w:gridCol w:w="2256"/>
+        <w:gridCol w:w="2256"/>
+        <w:gridCol w:w="2257"/>
+        <w:gridCol w:w="2257"/>
+      </w:tblGrid>
+      <w:tr>
+        <w:tc>
+          <w:tcPr>
+            <w:tcW w:w="2256" w:type="dxa"/>
+          </w:tcPr>
+          <w:p>
+            <w:r>
+              <w:rPr>
+                <w:rFonts w:ascii="Calibri" w:hAnsi="Calibri"/>
+                <w:b/>
+              </w:rPr>
+              <w:t>Medida</w:t>
+            </w:r>
+          </w:p>
+        </w:tc>
+        <w:tc>
+          <w:tcPr>
+            <w:tcW w:w="2256" w:type="dxa"/>
+          </w:tcPr>
+          <w:p>
+            <w:proofErr w:type="spellStart"/>
+            <w:r>
+              <w:rPr>
+                <w:rFonts w:ascii="Calibri" w:hAnsi="Calibri"/>
+                <w:b/>
+              </w:rPr>
+              <w:t>base_cindy</w:t>
+            </w:r>
+            <w:proofErr w:type="spellEnd"/>
+          </w:p>
+        </w:tc>
+        <w:tc>
+          <w:tcPr>
+            <w:tcW w:w="2256" w:type="dxa"/>
+          </w:tcPr>
+          <w:p>
+            <w:r>
+              <w:rPr>
+                <w:rFonts w:ascii="Calibri" w:hAnsi="Calibri"/>
+                <w:b/>
+              </w:rPr>
+              <w:t>escalado</w:t>
+            </w:r>
+          </w:p>
+        </w:tc>
+        <w:tc>
+          <w:tcPr>
+            <w:tcW w:w="2256" w:type="dxa"/>
+          </w:tcPr>
+          <w:p>
+            <w:r>
+              <w:rPr>
+                <w:rFonts w:ascii="Calibri" w:hAnsi="Calibri"/>
+                <w:b/>
+              </w:rPr>
+              <w:t>Factor (escalado / base)</w:t>
+            </w:r>
+          </w:p>
+        </w:tc>
+      </w:tr>
+      <w:tr>
+        <w:tc>
+          <w:tcPr>
+            <w:tcW w:w="2256" w:type="dxa"/>
+          </w:tcPr>
+          <w:p>
+            <w:proofErr w:type="spellStart"/>
+            <w:r>
+              <w:rPr>
+                <w:rFonts w:ascii="Calibri" w:hAnsi="Calibri"/>
+              </w:rPr>
+              <w:t>Throughput</w:t>
+            </w:r>
+            <w:proofErr w:type="spellEnd"/>
+            <w:r>
+              <w:rPr>
+                <w:rFonts w:ascii="Calibri" w:hAnsi="Calibri"/>
+              </w:rPr>
+              <w:t xml:space="preserve"> (lecturas/s)</w:t>
+            </w:r>
+          </w:p>
+        </w:tc>
+        <w:tc>
+          <w:tcPr>
+            <w:tcW w:w="2256" w:type="dxa"/>
+          </w:tcPr>
+          <w:p>
+            <w:r>
+              <w:rPr>
+                <w:rFonts w:ascii="Calibri" w:hAnsi="Calibri"/>
+              </w:rPr>
+              <w:t>33.99</w:t>
+            </w:r>
+          </w:p>
+        </w:tc>
+        <w:tc>
+          <w:tcPr>
+            <w:tcW w:w="2256" w:type="dxa"/>
+          </w:tcPr>
+          <w:p>
+            <w:r>
+              <w:rPr>
+                <w:rFonts w:ascii="Calibri" w:hAnsi="Calibri"/>
+              </w:rPr>
+              <w:t>49.18</w:t>
+            </w:r>
+          </w:p>
+        </w:tc>
+        <w:tc>
+          <w:tcPr>
+            <w:tcW w:w="2256" w:type="dxa"/>
+          </w:tcPr>
+          <w:p>
+            <w:r>
+              <w:rPr>
+                <w:rFonts w:ascii="Calibri" w:hAnsi="Calibri"/>
+              </w:rPr>
+              <w:t>1.45</w:t>
+            </w:r>
+          </w:p>
+        </w:tc>
+      </w:tr>
+      <w:tr>
+        <w:tc>
+          <w:tcPr>
+            <w:tcW w:w="2256" w:type="dxa"/>
+          </w:tcPr>
+          <w:p>
+            <w:r>
+              <w:rPr>
+                <w:rFonts w:ascii="Calibri" w:hAnsi="Calibri"/>
+              </w:rPr>
+              <w:t>p50 (ms)</w:t>
+            </w:r>
+          </w:p>
+        </w:tc>
+        <w:tc>
+          <w:tcPr>
+            <w:tcW w:w="2256" w:type="dxa"/>
+          </w:tcPr>
+          <w:p>
+            <w:r>
+              <w:rPr>
+                <w:rFonts w:ascii="Calibri" w:hAnsi="Calibri"/>
+              </w:rPr>
+              <w:t>289.0</w:t>
+            </w:r>
+          </w:p>
+        </w:tc>
+        <w:tc>
+          <w:tcPr>
+            <w:tcW w:w="2256" w:type="dxa"/>
+          </w:tcPr>
+          <w:p>
+            <w:r>
+              <w:rPr>
+                <w:rFonts w:ascii="Calibri" w:hAnsi="Calibri"/>
+              </w:rPr>
+              <w:t>23.8</w:t>
+            </w:r>
+          </w:p>
+        </w:tc>
+        <w:tc>
+          <w:tcPr>
+            <w:tcW w:w="2256" w:type="dxa"/>
+          </w:tcPr>
+          <w:p>
+            <w:r>
+              <w:rPr>
+                <w:rFonts w:ascii="Calibri" w:hAnsi="Calibri"/>
+              </w:rPr>
+              <w:t>0.08</w:t>
+            </w:r>
+          </w:p>
+        </w:tc>
+      </w:tr>
+      <w:tr>
+        <w:tc>
+          <w:tcPr>
+            <w:tcW w:w="2256" w:type="dxa"/>
+          </w:tcPr>
+          <w:p>
+            <w:r>
+              <w:rPr>
+                <w:rFonts w:ascii="Calibri" w:hAnsi="Calibri"/>
+              </w:rPr>
+              <w:t>p95 (ms)</w:t>
+            </w:r>
+          </w:p>
+        </w:tc>
+        <w:tc>
+          <w:tcPr>
+            <w:tcW w:w="2256" w:type="dxa"/>
+          </w:tcPr>
+          <w:p>
+            <w:r>
+              <w:rPr>
+                <w:rFonts w:ascii="Calibri" w:hAnsi="Calibri"/>
+              </w:rPr>
+              <w:t>433.9</w:t>
+            </w:r>
+          </w:p>
+        </w:tc>
+        <w:tc>
+          <w:tcPr>
+            <w:tcW w:w="2256" w:type="dxa"/>
+          </w:tcPr>
+          <w:p>
+            <w:r>
+              <w:rPr>
+                <w:rFonts w:ascii="Calibri" w:hAnsi="Calibri"/>
+              </w:rPr>
+              <w:t>701.3</w:t>
+            </w:r>
+          </w:p>
+        </w:tc>
+        <w:tc>
+          <w:tcPr>
+            <w:tcW w:w="2256" w:type="dxa"/>
+          </w:tcPr>
+          <w:p>
+            <w:r>
+              <w:rPr>
+                <w:rFonts w:ascii="Calibri" w:hAnsi="Calibri"/>
+              </w:rPr>
+              <w:t>1.62</w:t>
+            </w:r>
+          </w:p>
+        </w:tc>
+      </w:tr>
+      <w:tr>
+        <w:tc>
+          <w:tcPr>
+            <w:tcW w:w="2256" w:type="dxa"/>
+          </w:tcPr>
+          <w:p>
+            <w:r>
+              <w:rPr>
+                <w:rFonts w:ascii="Calibri" w:hAnsi="Calibri"/>
+              </w:rPr>
+              <w:t>p99 (ms)</w:t>
+            </w:r>
+          </w:p>
+        </w:tc>
+        <w:tc>
+          <w:tcPr>
+            <w:tcW w:w="2256" w:type="dxa"/>
+          </w:tcPr>
+          <w:p>
+            <w:r>
+              <w:rPr>
+                <w:rFonts w:ascii="Calibri" w:hAnsi="Calibri"/>
+              </w:rPr>
+              <w:t>696.1</w:t>
+            </w:r>
+          </w:p>
+        </w:tc>
+        <w:tc>
+          <w:tcPr>
+            <w:tcW w:w="2256" w:type="dxa"/>
+          </w:tcPr>
+          <w:p>
+            <w:r>
+              <w:rPr>
+                <w:rFonts w:ascii="Calibri" w:hAnsi="Calibri"/>
+              </w:rPr>
+              <w:t>1096.0</w:t>
+            </w:r>
+          </w:p>
+        </w:tc>
+        <w:tc>
+          <w:tcPr>
+            <w:tcW w:w="2256" w:type="dxa"/>
+          </w:tcPr>
+          <w:p>
+            <w:r>
+              <w:rPr>
+                <w:rFonts w:ascii="Calibri" w:hAnsi="Calibri"/>
+              </w:rPr>
+              <w:t>1.57</w:t>
+            </w:r>
+          </w:p>
+        </w:tc>
+      </w:tr>
+      <w:tr>
+        <w:tc>
+          <w:tcPr>
+            <w:tcW w:w="2256" w:type="dxa"/>
+          </w:tcPr>
+          <w:p>
+            <w:r>
+              <w:rPr>
+                <w:rFonts w:ascii="Calibri" w:hAnsi="Calibri"/>
+              </w:rPr>
+              <w:t>Máximo (ms)</w:t>
+            </w:r>
+          </w:p>
+        </w:tc>
+        <w:tc>
+          <w:tcPr>
+            <w:tcW w:w="2256" w:type="dxa"/>
+          </w:tcPr>
+          <w:p>
+            <w:r>
+              <w:rPr>
+                <w:rFonts w:ascii="Calibri" w:hAnsi="Calibri"/>
+              </w:rPr>
+              <w:t>1132.8</w:t>
+            </w:r>
+          </w:p>
+        </w:tc>
+        <w:tc>
+          <w:tcPr>
+            <w:tcW w:w="2256" w:type="dxa"/>
+          </w:tcPr>
+          <w:p>
+            <w:r>
+              <w:rPr>
+                <w:rFonts w:ascii="Calibri" w:hAnsi="Calibri"/>
+              </w:rPr>
+              <w:t>2054.4</w:t>
+            </w:r>
+          </w:p>
+        </w:tc>
+        <w:tc>
+          <w:tcPr>
+            <w:tcW w:w="2256" w:type="dxa"/>
+          </w:tcPr>
+          <w:p>
+            <w:r>
+              <w:rPr>
+                <w:rFonts w:ascii="Calibri" w:hAnsi="Calibri"/>
+              </w:rPr>
+              <w:t>1.81</w:t>
+            </w:r>
+          </w:p>
+        </w:tc>
+      </w:tr>
+    </w:tbl>
+    <w:p/>
+    <w:p>
+      <w:pPr>
+        <w:keepNext/>
+      </w:pPr>
+      <w:r>
+        <w:rPr>
+          <w:rFonts w:ascii="Calibri" w:hAnsi="Calibri"/>
+        </w:rPr>
+        <w:lastRenderedPageBreak/>
+        <w:t xml:space="preserve">Histograma de </w:t>
+      </w:r>
+      <w:proofErr w:type="spellStart"/>
+      <w:r>
+        <w:rPr>
+          <w:rFonts w:ascii="Calibri" w:hAnsi="Calibri"/>
+        </w:rPr>
+        <w:t>base_cindy</w:t>
+      </w:r>
+      <w:proofErr w:type="spellEnd"/>
+      <w:r>
+        <w:rPr>
+          <w:rFonts w:ascii="Calibri" w:hAnsi="Calibri"/>
+        </w:rPr>
+        <w:t>: un solo grupo alrededor de 290 ms.</w:t>
+      </w:r>
+    </w:p>
+    <w:p>
+      <w:r>
+        <w:rPr>
+          <w:noProof/>
+        </w:rPr>
+        <w:drawing>
+          <wp:inline distT="0" distB="0" distL="0" distR="0" wp14:anchorId="795C5E45" wp14:editId="679978D9">
+            <wp:extent cx="5731510" cy="3164096"/>
+            <wp:effectExtent l="0" t="0" r="0" b="0"/>
+            <wp:docPr id="692567598" name="Picture 692567598"/>
+            <wp:cNvGraphicFramePr>
+              <a:graphicFrameLocks xmlns:a="http://schemas.openxmlformats.org/drawingml/2006/main" noChangeAspect="1"/>
+            </wp:cNvGraphicFramePr>
+            <a:graphic xmlns:a="http://schemas.openxmlformats.org/drawingml/2006/main">
+              <a:graphicData uri="http://schemas.openxmlformats.org/drawingml/2006/picture">
+                <pic:pic xmlns:pic="http://schemas.openxmlformats.org/drawingml/2006/picture">
+                  <pic:nvPicPr>
+                    <pic:cNvPr id="0" name="C12_histograma_base_cindy.png"/>
+                    <pic:cNvPicPr/>
+                  </pic:nvPicPr>
+                  <pic:blipFill>
+                    <a:blip r:embed="rId41"/>
+                    <a:stretch>
+                      <a:fillRect/>
+                    </a:stretch>
+                  </pic:blipFill>
+                  <pic:spPr>
+                    <a:xfrm>
+                      <a:off x="0" y="0"/>
+                      <a:ext cx="5731510" cy="3164096"/>
+                    </a:xfrm>
+                    <a:prstGeom prst="rect">
+                      <a:avLst/>
+                    </a:prstGeom>
+                  </pic:spPr>
+                </pic:pic>
+              </a:graphicData>
+            </a:graphic>
+          </wp:inline>
+        </w:drawing>
+      </w:r>
+    </w:p>
+    <w:p>
+      <w:pPr>
+        <w:keepNext/>
+      </w:pPr>
+      <w:r>
+        <w:rPr>
+          <w:rFonts w:ascii="Calibri" w:hAnsi="Calibri"/>
+        </w:rPr>
+        <w:t>Histograma de escalado: la distribución cambió de forma. Un grupo muy rápido (api-1 y api-2) y otro lento entre 400 y 1000 ms (api-3).</w:t>
+      </w:r>
+    </w:p>
+    <w:p>
+      <w:r>
+        <w:rPr>
+          <w:noProof/>
+        </w:rPr>
+        <w:drawing>
+          <wp:inline distT="0" distB="0" distL="0" distR="0" wp14:anchorId="05BDF95F" wp14:editId="64147180">
+            <wp:extent cx="5731510" cy="3042238"/>
+            <wp:effectExtent l="0" t="0" r="0" b="0"/>
+            <wp:docPr id="692567599" name="Picture 692567599"/>
+            <wp:cNvGraphicFramePr>
+              <a:graphicFrameLocks xmlns:a="http://schemas.openxmlformats.org/drawingml/2006/main" noChangeAspect="1"/>
+            </wp:cNvGraphicFramePr>
+            <a:graphic xmlns:a="http://schemas.openxmlformats.org/drawingml/2006/main">
+              <a:graphicData uri="http://schemas.openxmlformats.org/drawingml/2006/picture">
+                <pic:pic xmlns:pic="http://schemas.openxmlformats.org/drawingml/2006/picture">
+                  <pic:nvPicPr>
+                    <pic:cNvPr id="0" name="C11_histograma_escalado.png"/>
+                    <pic:cNvPicPr/>
+                  </pic:nvPicPr>
+                  <pic:blipFill>
+                    <a:blip r:embed="rId42"/>
+                    <a:stretch>
+                      <a:fillRect/>
+                    </a:stretch>
+                  </pic:blipFill>
+                  <pic:spPr>
+                    <a:xfrm>
+                      <a:off x="0" y="0"/>
+                      <a:ext cx="5731510" cy="3042238"/>
+                    </a:xfrm>
+                    <a:prstGeom prst="rect">
+                      <a:avLst/>
+                    </a:prstGeom>
+                  </pic:spPr>
+                </pic:pic>
+              </a:graphicData>
+            </a:graphic>
+          </wp:inline>
+        </w:drawing>
+      </w:r>
+    </w:p>
+    <w:p>
+      <w:pPr>
+        <w:pStyle w:val="Ttulo1"/>
+      </w:pPr>
+      <w:r>
+        <w:t>8.5</w:t>
+      </w:r>
+    </w:p>
+    <w:p>
+      <w:pPr>
+        <w:keepNext/>
+      </w:pPr>
+      <w:r>
+        <w:rPr>
+          <w:rFonts w:ascii="Calibri" w:hAnsi="Calibri"/>
+        </w:rPr>
+        <w:lastRenderedPageBreak/>
+        <w:t xml:space="preserve">sum </w:t>
+      </w:r>
+      <w:proofErr w:type="spellStart"/>
+      <w:r>
+        <w:rPr>
+          <w:rFonts w:ascii="Calibri" w:hAnsi="Calibri"/>
+        </w:rPr>
+        <w:t>by</w:t>
+      </w:r>
+      <w:proofErr w:type="spellEnd"/>
+      <w:r>
+        <w:rPr>
+          <w:rFonts w:ascii="Calibri" w:hAnsi="Calibri"/>
+        </w:rPr>
+        <w:t xml:space="preserve"> (</w:t>
+      </w:r>
+      <w:proofErr w:type="spellStart"/>
+      <w:r>
+        <w:rPr>
+          <w:rFonts w:ascii="Calibri" w:hAnsi="Calibri"/>
+        </w:rPr>
+        <w:t>instance</w:t>
+      </w:r>
+      <w:proofErr w:type="spellEnd"/>
+      <w:r>
+        <w:rPr>
+          <w:rFonts w:ascii="Calibri" w:hAnsi="Calibri"/>
+        </w:rPr>
+        <w:t>) (</w:t>
+      </w:r>
+      <w:proofErr w:type="spellStart"/>
+      <w:r>
+        <w:rPr>
+          <w:rFonts w:ascii="Calibri" w:hAnsi="Calibri"/>
+        </w:rPr>
+        <w:t>rate</w:t>
+      </w:r>
+      <w:proofErr w:type="spellEnd"/>
+      <w:r>
+        <w:rPr>
+          <w:rFonts w:ascii="Calibri" w:hAnsi="Calibri"/>
+        </w:rPr>
+        <w:t>(</w:t>
+      </w:r>
+      <w:proofErr w:type="spellStart"/>
+      <w:r>
+        <w:rPr>
+          <w:rFonts w:ascii="Calibri" w:hAnsi="Calibri"/>
+        </w:rPr>
+        <w:t>smartcity_solicitud_duracion_segundos_count</w:t>
+      </w:r>
+      <w:proofErr w:type="spellEnd"/>
+      <w:r>
+        <w:rPr>
+          <w:rFonts w:ascii="Calibri" w:hAnsi="Calibri"/>
+        </w:rPr>
+        <w:t>[1m])): las tres réplicas reciben casi lo mismo (hora en UTC, 02:50 = 20:50 local).</w:t>
+      </w:r>
+    </w:p>
+    <w:p>
+      <w:r>
+        <w:rPr>
+          <w:noProof/>
+        </w:rPr>
+        <w:drawing>
+          <wp:inline distT="0" distB="0" distL="0" distR="0" wp14:anchorId="7F5319FB" wp14:editId="3218B443">
+            <wp:extent cx="5731510" cy="2714261"/>
+            <wp:effectExtent l="0" t="0" r="0" b="0"/>
+            <wp:docPr id="692567600" name="Picture 692567600"/>
+            <wp:cNvGraphicFramePr>
+              <a:graphicFrameLocks xmlns:a="http://schemas.openxmlformats.org/drawingml/2006/main" noChangeAspect="1"/>
+            </wp:cNvGraphicFramePr>
+            <a:graphic xmlns:a="http://schemas.openxmlformats.org/drawingml/2006/main">
+              <a:graphicData uri="http://schemas.openxmlformats.org/drawingml/2006/picture">
+                <pic:pic xmlns:pic="http://schemas.openxmlformats.org/drawingml/2006/picture">
+                  <pic:nvPicPr>
+                    <pic:cNvPr id="0" name="C8_prom_rate_por_replica.png"/>
+                    <pic:cNvPicPr/>
+                  </pic:nvPicPr>
+                  <pic:blipFill>
+                    <a:blip r:embed="rId43"/>
+                    <a:stretch>
+                      <a:fillRect/>
+                    </a:stretch>
+                  </pic:blipFill>
+                  <pic:spPr>
+                    <a:xfrm>
+                      <a:off x="0" y="0"/>
+                      <a:ext cx="5731510" cy="2714261"/>
+                    </a:xfrm>
+                    <a:prstGeom prst="rect">
+                      <a:avLst/>
+                    </a:prstGeom>
+                  </pic:spPr>
+                </pic:pic>
+              </a:graphicData>
+            </a:graphic>
+          </wp:inline>
+        </w:drawing>
+      </w:r>
+    </w:p>
+    <w:p>
+      <w:pPr>
+        <w:keepNext/>
+      </w:pPr>
+      <w:r>
+        <w:rPr>
+          <w:rFonts w:ascii="Calibri" w:hAnsi="Calibri"/>
+        </w:rPr>
+        <w:t>Misma consulta con [2m], evaluada al final de escalado (02:51:41 UTC): 16.82, 16.62 y 16.51 lecturas/s.</w:t>
+      </w:r>
+    </w:p>
+    <w:p>
+      <w:r>
+        <w:rPr>
+          <w:noProof/>
+        </w:rPr>
+        <w:drawing>
+          <wp:inline distT="0" distB="0" distL="0" distR="0" wp14:anchorId="78C82E67" wp14:editId="32A90ADF">
+            <wp:extent cx="5731510" cy="2691500"/>
+            <wp:effectExtent l="0" t="0" r="0" b="0"/>
+            <wp:docPr id="692567601" name="Picture 692567601"/>
+            <wp:cNvGraphicFramePr>
+              <a:graphicFrameLocks xmlns:a="http://schemas.openxmlformats.org/drawingml/2006/main" noChangeAspect="1"/>
+            </wp:cNvGraphicFramePr>
+            <a:graphic xmlns:a="http://schemas.openxmlformats.org/drawingml/2006/main">
+              <a:graphicData uri="http://schemas.openxmlformats.org/drawingml/2006/picture">
+                <pic:pic xmlns:pic="http://schemas.openxmlformats.org/drawingml/2006/picture">
+                  <pic:nvPicPr>
+                    <pic:cNvPr id="0" name="C8b_prom_rate_por_replica_tabla.png"/>
+                    <pic:cNvPicPr/>
+                  </pic:nvPicPr>
+                  <pic:blipFill>
+                    <a:blip r:embed="rId44"/>
+                    <a:stretch>
+                      <a:fillRect/>
+                    </a:stretch>
+                  </pic:blipFill>
+                  <pic:spPr>
+                    <a:xfrm>
+                      <a:off x="0" y="0"/>
+                      <a:ext cx="5731510" cy="2691500"/>
+                    </a:xfrm>
+                    <a:prstGeom prst="rect">
+                      <a:avLst/>
+                    </a:prstGeom>
+                  </pic:spPr>
+                </pic:pic>
+              </a:graphicData>
+            </a:graphic>
+          </wp:inline>
+        </w:drawing>
+      </w:r>
+    </w:p>
+    <w:p>
+      <w:pPr>
+        <w:keepNext/>
+      </w:pPr>
+      <w:proofErr w:type="spellStart"/>
+      <w:r>
+        <w:rPr>
+          <w:rFonts w:ascii="Calibri" w:hAnsi="Calibri"/>
+        </w:rPr>
+        <w:lastRenderedPageBreak/>
+        <w:t>histogram_</w:t>
+      </w:r>
+      <w:proofErr w:type="gramStart"/>
+      <w:r>
+        <w:rPr>
+          <w:rFonts w:ascii="Calibri" w:hAnsi="Calibri"/>
+        </w:rPr>
+        <w:t>quantile</w:t>
+      </w:r>
+      <w:proofErr w:type="spellEnd"/>
+      <w:r>
+        <w:rPr>
+          <w:rFonts w:ascii="Calibri" w:hAnsi="Calibri"/>
+        </w:rPr>
+        <w:t>(</w:t>
+      </w:r>
+      <w:proofErr w:type="gramEnd"/>
+      <w:r>
+        <w:rPr>
+          <w:rFonts w:ascii="Calibri" w:hAnsi="Calibri"/>
+        </w:rPr>
+        <w:t xml:space="preserve">0.95, sum </w:t>
+      </w:r>
+      <w:proofErr w:type="spellStart"/>
+      <w:r>
+        <w:rPr>
+          <w:rFonts w:ascii="Calibri" w:hAnsi="Calibri"/>
+        </w:rPr>
+        <w:t>by</w:t>
+      </w:r>
+      <w:proofErr w:type="spellEnd"/>
+      <w:r>
+        <w:rPr>
+          <w:rFonts w:ascii="Calibri" w:hAnsi="Calibri"/>
+        </w:rPr>
+        <w:t xml:space="preserve"> (le, </w:t>
+      </w:r>
+      <w:proofErr w:type="spellStart"/>
+      <w:r>
+        <w:rPr>
+          <w:rFonts w:ascii="Calibri" w:hAnsi="Calibri"/>
+        </w:rPr>
+        <w:t>instance</w:t>
+      </w:r>
+      <w:proofErr w:type="spellEnd"/>
+      <w:r>
+        <w:rPr>
+          <w:rFonts w:ascii="Calibri" w:hAnsi="Calibri"/>
+        </w:rPr>
+        <w:t>) (</w:t>
+      </w:r>
+      <w:proofErr w:type="spellStart"/>
+      <w:r>
+        <w:rPr>
+          <w:rFonts w:ascii="Calibri" w:hAnsi="Calibri"/>
+        </w:rPr>
+        <w:t>rate</w:t>
+      </w:r>
+      <w:proofErr w:type="spellEnd"/>
+      <w:r>
+        <w:rPr>
+          <w:rFonts w:ascii="Calibri" w:hAnsi="Calibri"/>
+        </w:rPr>
+        <w:t>(</w:t>
+      </w:r>
+      <w:proofErr w:type="spellStart"/>
+      <w:r>
+        <w:rPr>
+          <w:rFonts w:ascii="Calibri" w:hAnsi="Calibri"/>
+        </w:rPr>
+        <w:t>smartcity_solicitud_duracion_segundos_bucket</w:t>
+      </w:r>
+      <w:proofErr w:type="spellEnd"/>
+      <w:r>
+        <w:rPr>
+          <w:rFonts w:ascii="Calibri" w:hAnsi="Calibri"/>
+        </w:rPr>
+        <w:t>[1m]))) * 1000: api-3 se mantiene cerca de 1 s y las otras cerca de 100 ms.</w:t>
+      </w:r>
+    </w:p>
+    <w:p>
+      <w:r>
+        <w:rPr>
+          <w:noProof/>
+        </w:rPr>
+        <w:drawing>
+          <wp:inline distT="0" distB="0" distL="0" distR="0" wp14:anchorId="1A12E4C1" wp14:editId="61DE8E7D">
+            <wp:extent cx="5731510" cy="2667096"/>
+            <wp:effectExtent l="0" t="0" r="0" b="0"/>
+            <wp:docPr id="692567602" name="Picture 692567602"/>
+            <wp:cNvGraphicFramePr>
+              <a:graphicFrameLocks xmlns:a="http://schemas.openxmlformats.org/drawingml/2006/main" noChangeAspect="1"/>
+            </wp:cNvGraphicFramePr>
+            <a:graphic xmlns:a="http://schemas.openxmlformats.org/drawingml/2006/main">
+              <a:graphicData uri="http://schemas.openxmlformats.org/drawingml/2006/picture">
+                <pic:pic xmlns:pic="http://schemas.openxmlformats.org/drawingml/2006/picture">
+                  <pic:nvPicPr>
+                    <pic:cNvPr id="0" name="C9_prom_p95_por_replica.png"/>
+                    <pic:cNvPicPr/>
+                  </pic:nvPicPr>
+                  <pic:blipFill>
+                    <a:blip r:embed="rId45"/>
+                    <a:stretch>
+                      <a:fillRect/>
+                    </a:stretch>
+                  </pic:blipFill>
+                  <pic:spPr>
+                    <a:xfrm>
+                      <a:off x="0" y="0"/>
+                      <a:ext cx="5731510" cy="2667096"/>
+                    </a:xfrm>
+                    <a:prstGeom prst="rect">
+                      <a:avLst/>
+                    </a:prstGeom>
+                  </pic:spPr>
+                </pic:pic>
+              </a:graphicData>
+            </a:graphic>
+          </wp:inline>
+        </w:drawing>
+      </w:r>
+    </w:p>
+    <w:p>
+      <w:pPr>
+        <w:keepNext/>
+      </w:pPr>
+      <w:r>
+        <w:rPr>
+          <w:rFonts w:ascii="Calibri" w:hAnsi="Calibri"/>
+        </w:rPr>
+        <w:t>Misma consulta con [2m] al final de escalado: api-1 95.3 ms, api-2 98.3 ms, api-3 977.5 ms.</w:t>
+      </w:r>
+    </w:p>
+    <w:p>
+      <w:r>
+        <w:rPr>
+          <w:noProof/>
+        </w:rPr>
+        <w:drawing>
+          <wp:inline distT="0" distB="0" distL="0" distR="0" wp14:anchorId="320D2B1A" wp14:editId="3E3B482E">
+            <wp:extent cx="5731510" cy="2544539"/>
+            <wp:effectExtent l="0" t="0" r="0" b="0"/>
+            <wp:docPr id="692567603" name="Picture 692567603"/>
+            <wp:cNvGraphicFramePr>
+              <a:graphicFrameLocks xmlns:a="http://schemas.openxmlformats.org/drawingml/2006/main" noChangeAspect="1"/>
+            </wp:cNvGraphicFramePr>
+            <a:graphic xmlns:a="http://schemas.openxmlformats.org/drawingml/2006/main">
+              <a:graphicData uri="http://schemas.openxmlformats.org/drawingml/2006/picture">
+                <pic:pic xmlns:pic="http://schemas.openxmlformats.org/drawingml/2006/picture">
+                  <pic:nvPicPr>
+                    <pic:cNvPr id="0" name="C9b_prom_p95_por_replica_tabla.png"/>
+                    <pic:cNvPicPr/>
+                  </pic:nvPicPr>
+                  <pic:blipFill>
+                    <a:blip r:embed="rId46"/>
+                    <a:stretch>
+                      <a:fillRect/>
+                    </a:stretch>
+                  </pic:blipFill>
+                  <pic:spPr>
+                    <a:xfrm>
+                      <a:off x="0" y="0"/>
+                      <a:ext cx="5731510" cy="2544539"/>
+                    </a:xfrm>
+                    <a:prstGeom prst="rect">
+                      <a:avLst/>
+                    </a:prstGeom>
+                  </pic:spPr>
+                </pic:pic>
+              </a:graphicData>
+            </a:graphic>
+          </wp:inline>
+        </w:drawing>
+      </w:r>
+    </w:p>
+    <w:tbl>
+      <w:tblPr>
+        <w:tblW w:w="9026" w:type="dxa"/>
+        <w:tblBorders>
+          <w:top w:val="single" w:sz="4" w:space="0" w:color="000000"/>
+          <w:left w:val="single" w:sz="4" w:space="0" w:color="000000"/>
+          <w:bottom w:val="single" w:sz="4" w:space="0" w:color="000000"/>
+          <w:right w:val="single" w:sz="4" w:space="0" w:color="000000"/>
+          <w:insideH w:val="single" w:sz="4" w:space="0" w:color="000000"/>
+          <w:insideV w:val="single" w:sz="4" w:space="0" w:color="000000"/>
+        </w:tblBorders>
+        <w:tblLook w:val="04A0" w:firstRow="1" w:lastRow="0" w:firstColumn="1" w:lastColumn="0" w:noHBand="0" w:noVBand="1"/>
+      </w:tblPr>
+      <w:tblGrid>
+        <w:gridCol w:w="1806"/>
+        <w:gridCol w:w="1805"/>
+        <w:gridCol w:w="1805"/>
+        <w:gridCol w:w="1805"/>
+        <w:gridCol w:w="1805"/>
+      </w:tblGrid>
+      <w:tr>
+        <w:tc>
+          <w:tcPr>
+            <w:tcW w:w="1805" w:type="dxa"/>
+          </w:tcPr>
+          <w:p>
+            <w:r>
+              <w:rPr>
+                <w:rFonts w:ascii="Calibri" w:hAnsi="Calibri"/>
+                <w:b/>
+              </w:rPr>
+              <w:t>Réplica</w:t>
+            </w:r>
+          </w:p>
+        </w:tc>
+        <w:tc>
+          <w:tcPr>
+            <w:tcW w:w="1805" w:type="dxa"/>
+          </w:tcPr>
+          <w:p>
+            <w:r>
+              <w:rPr>
+                <w:rFonts w:ascii="Calibri" w:hAnsi="Calibri"/>
+                <w:b/>
+              </w:rPr>
+              <w:t>Límite de CPU</w:t>
+            </w:r>
+          </w:p>
+        </w:tc>
+        <w:tc>
+          <w:tcPr>
+            <w:tcW w:w="1805" w:type="dxa"/>
+          </w:tcPr>
+          <w:p>
+            <w:r>
+              <w:rPr>
+                <w:rFonts w:ascii="Calibri" w:hAnsi="Calibri"/>
+                <w:b/>
+              </w:rPr>
+              <w:t>Solicitudes/s</w:t>
+            </w:r>
+          </w:p>
+        </w:tc>
+        <w:tc>
+          <w:tcPr>
+            <w:tcW w:w="1805" w:type="dxa"/>
+          </w:tcPr>
+          <w:p>
+            <w:r>
+              <w:rPr>
+                <w:rFonts w:ascii="Calibri" w:hAnsi="Calibri"/>
+                <w:b/>
+              </w:rPr>
+              <w:t>p95 (ms)</w:t>
+            </w:r>
+          </w:p>
+        </w:tc>
+        <w:tc>
+          <w:tcPr>
+            <w:tcW w:w="1805" w:type="dxa"/>
+          </w:tcPr>
+          <w:p>
+            <w:r>
+              <w:rPr>
+                <w:rFonts w:ascii="Calibri" w:hAnsi="Calibri"/>
+                <w:b/>
+              </w:rPr>
+              <w:t xml:space="preserve">CPU en </w:t>
+            </w:r>
+            <w:proofErr w:type="spellStart"/>
+            <w:r>
+              <w:rPr>
+                <w:rFonts w:ascii="Calibri" w:hAnsi="Calibri"/>
+                <w:b/>
+              </w:rPr>
+              <w:t>docker</w:t>
+            </w:r>
+            <w:proofErr w:type="spellEnd"/>
+            <w:r>
+              <w:rPr>
+                <w:rFonts w:ascii="Calibri" w:hAnsi="Calibri"/>
+                <w:b/>
+              </w:rPr>
+              <w:t xml:space="preserve"> </w:t>
+            </w:r>
+            <w:proofErr w:type="spellStart"/>
+            <w:r>
+              <w:rPr>
+                <w:rFonts w:ascii="Calibri" w:hAnsi="Calibri"/>
+                <w:b/>
+              </w:rPr>
+              <w:t>stats</w:t>
+            </w:r>
+            <w:proofErr w:type="spellEnd"/>
+          </w:p>
+        </w:tc>
+      </w:tr>
+      <w:tr>
+        <w:tc>
+          <w:tcPr>
+            <w:tcW w:w="1805" w:type="dxa"/>
+          </w:tcPr>
+          <w:p>
+            <w:r>
+              <w:rPr>
+                <w:rFonts w:ascii="Calibri" w:hAnsi="Calibri"/>
+              </w:rPr>
+              <w:t>api-1</w:t>
+            </w:r>
+          </w:p>
+        </w:tc>
+        <w:tc>
+          <w:tcPr>
+            <w:tcW w:w="1805" w:type="dxa"/>
+          </w:tcPr>
+          <w:p>
+            <w:r>
+              <w:rPr>
+                <w:rFonts w:ascii="Calibri" w:hAnsi="Calibri"/>
+              </w:rPr>
+              <w:t>0.5</w:t>
+            </w:r>
+          </w:p>
+        </w:tc>
+        <w:tc>
+          <w:tcPr>
+            <w:tcW w:w="1805" w:type="dxa"/>
+          </w:tcPr>
+          <w:p>
+            <w:r>
+              <w:rPr>
+                <w:rFonts w:ascii="Calibri" w:hAnsi="Calibri"/>
+              </w:rPr>
+              <w:t>16.82</w:t>
+            </w:r>
+          </w:p>
+        </w:tc>
+        <w:tc>
+          <w:tcPr>
+            <w:tcW w:w="1805" w:type="dxa"/>
+          </w:tcPr>
+          <w:p>
+            <w:r>
+              <w:rPr>
+                <w:rFonts w:ascii="Calibri" w:hAnsi="Calibri"/>
+              </w:rPr>
+              <w:t>95.3</w:t>
+            </w:r>
+          </w:p>
+        </w:tc>
+        <w:tc>
+          <w:tcPr>
+            <w:tcW w:w="1805" w:type="dxa"/>
+          </w:tcPr>
+          <w:p>
+            <w:r>
+              <w:rPr>
+                <w:rFonts w:ascii="Calibri" w:hAnsi="Calibri"/>
+              </w:rPr>
+              <w:t>24.96 % (~50 % de su límite)</w:t>
+            </w:r>
+          </w:p>
+        </w:tc>
+      </w:tr>
+      <w:tr>
+        <w:tc>
+          <w:tcPr>
+            <w:tcW w:w="1805" w:type="dxa"/>
+          </w:tcPr>
+          <w:p>
+            <w:r>
+              <w:rPr>
+                <w:rFonts w:ascii="Calibri" w:hAnsi="Calibri"/>
+              </w:rPr>
+              <w:t>api-2</w:t>
+            </w:r>
+          </w:p>
+        </w:tc>
+        <w:tc>
+          <w:tcPr>
+            <w:tcW w:w="1805" w:type="dxa"/>
+          </w:tcPr>
+          <w:p>
+            <w:r>
+              <w:rPr>
+                <w:rFonts w:ascii="Calibri" w:hAnsi="Calibri"/>
+              </w:rPr>
+              <w:t>0.5</w:t>
+            </w:r>
+          </w:p>
+        </w:tc>
+        <w:tc>
+          <w:tcPr>
+            <w:tcW w:w="1805" w:type="dxa"/>
+          </w:tcPr>
+          <w:p>
+            <w:r>
+              <w:rPr>
+                <w:rFonts w:ascii="Calibri" w:hAnsi="Calibri"/>
+              </w:rPr>
+              <w:t>16.62</w:t>
+            </w:r>
+          </w:p>
+        </w:tc>
+        <w:tc>
+          <w:tcPr>
+            <w:tcW w:w="1805" w:type="dxa"/>
+          </w:tcPr>
+          <w:p>
+            <w:r>
+              <w:rPr>
+                <w:rFonts w:ascii="Calibri" w:hAnsi="Calibri"/>
+              </w:rPr>
+              <w:t>98.3</w:t>
+            </w:r>
+          </w:p>
+        </w:tc>
+        <w:tc>
+          <w:tcPr>
+            <w:tcW w:w="1805" w:type="dxa"/>
+          </w:tcPr>
+          <w:p>
+            <w:r>
+              <w:rPr>
+                <w:rFonts w:ascii="Calibri" w:hAnsi="Calibri"/>
+              </w:rPr>
+              <w:t>22.99 % (~46 % de su límite)</w:t>
+            </w:r>
+          </w:p>
+        </w:tc>
+      </w:tr>
+      <w:tr>
+        <w:tc>
+          <w:tcPr>
+            <w:tcW w:w="1805" w:type="dxa"/>
+          </w:tcPr>
+          <w:p>
+            <w:r>
+              <w:rPr>
+                <w:rFonts w:ascii="Calibri" w:hAnsi="Calibri"/>
+              </w:rPr>
+              <w:t>api-3</w:t>
+            </w:r>
+          </w:p>
+        </w:tc>
+        <w:tc>
+          <w:tcPr>
+            <w:tcW w:w="1805" w:type="dxa"/>
+          </w:tcPr>
+          <w:p>
+            <w:r>
+              <w:rPr>
+                <w:rFonts w:ascii="Calibri" w:hAnsi="Calibri"/>
+              </w:rPr>
+              <w:t>0.25</w:t>
+            </w:r>
+          </w:p>
+        </w:tc>
+        <w:tc>
+          <w:tcPr>
+            <w:tcW w:w="1805" w:type="dxa"/>
+          </w:tcPr>
+          <w:p>
+            <w:r>
+              <w:rPr>
+                <w:rFonts w:ascii="Calibri" w:hAnsi="Calibri"/>
+              </w:rPr>
+              <w:t>16.51</w:t>
+            </w:r>
+          </w:p>
+        </w:tc>
+        <w:tc>
+          <w:tcPr>
+            <w:tcW w:w="1805" w:type="dxa"/>
+          </w:tcPr>
+          <w:p>
+            <w:r>
+              <w:rPr>
+                <w:rFonts w:ascii="Calibri" w:hAnsi="Calibri"/>
+              </w:rPr>
+              <w:t>977.5</w:t>
+            </w:r>
+          </w:p>
+        </w:tc>
+        <w:tc>
+          <w:tcPr>
+            <w:tcW w:w="1805" w:type="dxa"/>
+          </w:tcPr>
+          <w:p>
+            <w:r>
+              <w:rPr>
+                <w:rFonts w:ascii="Calibri" w:hAnsi="Calibri"/>
+              </w:rPr>
+              <w:t>25.58 % (~100 % de su límite)</w:t>
+            </w:r>
+          </w:p>
+        </w:tc>
+      </w:tr>
+    </w:tbl>
+    <w:p/>
+    <w:p>
+      <w:r>
+        <w:rPr>
+          <w:rFonts w:ascii="Calibri" w:hAnsi="Calibri"/>
+        </w:rPr>
+        <w:lastRenderedPageBreak/>
+        <w:t xml:space="preserve">Las tres réplicas reciben la misma cantidad de lecturas porque </w:t>
+      </w:r>
+      <w:proofErr w:type="spellStart"/>
+      <w:r>
+        <w:rPr>
+          <w:rFonts w:ascii="Calibri" w:hAnsi="Calibri"/>
+        </w:rPr>
+        <w:t>Traefik</w:t>
+      </w:r>
+      <w:proofErr w:type="spellEnd"/>
+      <w:r>
+        <w:rPr>
+          <w:rFonts w:ascii="Calibri" w:hAnsi="Calibri"/>
+        </w:rPr>
+        <w:t xml:space="preserve"> reparte por round-</w:t>
+      </w:r>
+      <w:proofErr w:type="spellStart"/>
+      <w:r>
+        <w:rPr>
+          <w:rFonts w:ascii="Calibri" w:hAnsi="Calibri"/>
+        </w:rPr>
+        <w:t>robin</w:t>
+      </w:r>
+      <w:proofErr w:type="spellEnd"/>
+      <w:r>
+        <w:rPr>
+          <w:rFonts w:ascii="Calibri" w:hAnsi="Calibri"/>
+        </w:rPr>
+        <w:t xml:space="preserve"> con el mismo peso. api-3 tiene la mitad de CPU, se satura y se le forma fila, por eso tarda unas 10 veces más. El </w:t>
+      </w:r>
+      <w:proofErr w:type="spellStart"/>
+      <w:r>
+        <w:rPr>
+          <w:rFonts w:ascii="Calibri" w:hAnsi="Calibri"/>
+        </w:rPr>
+        <w:t>throughput</w:t>
+      </w:r>
+      <w:proofErr w:type="spellEnd"/>
+      <w:r>
+        <w:rPr>
+          <w:rFonts w:ascii="Calibri" w:hAnsi="Calibri"/>
+        </w:rPr>
+        <w:t xml:space="preserve"> subió 1.45 veces y no 3, y el p99 empeoró porque la cola sale de api-3.</w:t>
+      </w:r>
+    </w:p>
+    <w:p>
+      <w:pPr>
+        <w:keepNext/>
+      </w:pPr>
+      <w:proofErr w:type="spellStart"/>
+      <w:r>
+        <w:rPr>
+          <w:rFonts w:ascii="Calibri" w:hAnsi="Calibri"/>
+        </w:rPr>
+        <w:t>Dashboard</w:t>
+      </w:r>
+      <w:proofErr w:type="spellEnd"/>
+      <w:r>
+        <w:rPr>
+          <w:rFonts w:ascii="Calibri" w:hAnsi="Calibri"/>
+        </w:rPr>
+        <w:t xml:space="preserve"> de </w:t>
+      </w:r>
+      <w:proofErr w:type="spellStart"/>
+      <w:r>
+        <w:rPr>
+          <w:rFonts w:ascii="Calibri" w:hAnsi="Calibri"/>
+        </w:rPr>
+        <w:t>Grafana</w:t>
+      </w:r>
+      <w:proofErr w:type="spellEnd"/>
+      <w:r>
+        <w:rPr>
+          <w:rFonts w:ascii="Calibri" w:hAnsi="Calibri"/>
+        </w:rPr>
+        <w:t xml:space="preserve"> completo durante escalado (20:49 a 20:51).</w:t>
+      </w:r>
+    </w:p>
+    <w:p>
+      <w:r>
+        <w:rPr>
+          <w:noProof/>
+        </w:rPr>
+        <w:drawing>
+          <wp:inline distT="0" distB="0" distL="0" distR="0" wp14:anchorId="034CEE59" wp14:editId="39607372">
+            <wp:extent cx="5731510" cy="1639380"/>
+            <wp:effectExtent l="0" t="0" r="0" b="0"/>
+            <wp:docPr id="692567604" name="Picture 692567604"/>
+            <wp:cNvGraphicFramePr>
+              <a:graphicFrameLocks xmlns:a="http://schemas.openxmlformats.org/drawingml/2006/main" noChangeAspect="1"/>
+            </wp:cNvGraphicFramePr>
+            <a:graphic xmlns:a="http://schemas.openxmlformats.org/drawingml/2006/main">
+              <a:graphicData uri="http://schemas.openxmlformats.org/drawingml/2006/picture">
+                <pic:pic xmlns:pic="http://schemas.openxmlformats.org/drawingml/2006/picture">
+                  <pic:nvPicPr>
+                    <pic:cNvPr id="0" name="C10_grafana_escalado_completo.png"/>
+                    <pic:cNvPicPr/>
+                  </pic:nvPicPr>
+                  <pic:blipFill>
+                    <a:blip r:embed="rId47"/>
+                    <a:stretch>
+                      <a:fillRect/>
+                    </a:stretch>
+                  </pic:blipFill>
+                  <pic:spPr>
+                    <a:xfrm>
+                      <a:off x="0" y="0"/>
+                      <a:ext cx="5731510" cy="1639380"/>
+                    </a:xfrm>
+                    <a:prstGeom prst="rect">
+                      <a:avLst/>
+                    </a:prstGeom>
+                  </pic:spPr>
+                </pic:pic>
+              </a:graphicData>
+            </a:graphic>
+          </wp:inline>
+        </w:drawing>
+      </w:r>
+    </w:p>
+    <w:p>
+      <w:pPr>
+        <w:keepNext/>
+      </w:pPr>
+      <w:r>
+        <w:rPr>
+          <w:rFonts w:ascii="Calibri" w:hAnsi="Calibri"/>
+        </w:rPr>
+        <w:t>Detalle de los paneles superiores.</w:t>
+      </w:r>
+    </w:p>
+    <w:p>
+      <w:r>
+        <w:rPr>
+          <w:noProof/>
+        </w:rPr>
+        <w:drawing>
+          <wp:inline distT="0" distB="0" distL="0" distR="0" wp14:anchorId="4439AF36" wp14:editId="74039071">
+            <wp:extent cx="5731510" cy="2830012"/>
+            <wp:effectExtent l="0" t="0" r="0" b="0"/>
+            <wp:docPr id="692567605" name="Picture 692567605"/>
+            <wp:cNvGraphicFramePr>
+              <a:graphicFrameLocks xmlns:a="http://schemas.openxmlformats.org/drawingml/2006/main" noChangeAspect="1"/>
+            </wp:cNvGraphicFramePr>
+            <a:graphic xmlns:a="http://schemas.openxmlformats.org/drawingml/2006/main">
+              <a:graphicData uri="http://schemas.openxmlformats.org/drawingml/2006/picture">
+                <pic:pic xmlns:pic="http://schemas.openxmlformats.org/drawingml/2006/picture">
+                  <pic:nvPicPr>
+                    <pic:cNvPr id="0" name="C10a_grafana_escalado.png"/>
+                    <pic:cNvPicPr/>
+                  </pic:nvPicPr>
+                  <pic:blipFill>
+                    <a:blip r:embed="rId48"/>
+                    <a:stretch>
+                      <a:fillRect/>
+                    </a:stretch>
+                  </pic:blipFill>
+                  <pic:spPr>
+                    <a:xfrm>
+                      <a:off x="0" y="0"/>
+                      <a:ext cx="5731510" cy="2830012"/>
+                    </a:xfrm>
+                    <a:prstGeom prst="rect">
+                      <a:avLst/>
+                    </a:prstGeom>
+                  </pic:spPr>
+                </pic:pic>
+              </a:graphicData>
+            </a:graphic>
+          </wp:inline>
+        </w:drawing>
+      </w:r>
+    </w:p>
+    <w:p>
+      <w:pPr>
+        <w:keepNext/>
+      </w:pPr>
+      <w:r>
+        <w:rPr>
+          <w:rFonts w:ascii="Calibri" w:hAnsi="Calibri"/>
+        </w:rPr>
+        <w:lastRenderedPageBreak/>
+        <w:t>Detalle de los paneles inferiores. El panel de porcentaje de fallas muestra "No data" en vez de 0 %.</w:t>
+      </w:r>
+    </w:p>
+    <w:p>
+      <w:r>
+        <w:rPr>
+          <w:noProof/>
+        </w:rPr>
+        <w:drawing>
+          <wp:inline distT="0" distB="0" distL="0" distR="0" wp14:anchorId="47C9397C" wp14:editId="0DAF1C65">
+            <wp:extent cx="5731510" cy="2716940"/>
+            <wp:effectExtent l="0" t="0" r="0" b="0"/>
+            <wp:docPr id="692567606" name="Picture 692567606"/>
+            <wp:cNvGraphicFramePr>
+              <a:graphicFrameLocks xmlns:a="http://schemas.openxmlformats.org/drawingml/2006/main" noChangeAspect="1"/>
+            </wp:cNvGraphicFramePr>
+            <a:graphic xmlns:a="http://schemas.openxmlformats.org/drawingml/2006/main">
+              <a:graphicData uri="http://schemas.openxmlformats.org/drawingml/2006/picture">
+                <pic:pic xmlns:pic="http://schemas.openxmlformats.org/drawingml/2006/picture">
+                  <pic:nvPicPr>
+                    <pic:cNvPr id="0" name="C10c_grafana_escalado.png"/>
+                    <pic:cNvPicPr/>
+                  </pic:nvPicPr>
+                  <pic:blipFill>
+                    <a:blip r:embed="rId49"/>
+                    <a:stretch>
+                      <a:fillRect/>
+                    </a:stretch>
+                  </pic:blipFill>
+                  <pic:spPr>
+                    <a:xfrm>
+                      <a:off x="0" y="0"/>
+                      <a:ext cx="5731510" cy="2716940"/>
+                    </a:xfrm>
+                    <a:prstGeom prst="rect">
+                      <a:avLst/>
+                    </a:prstGeom>
+                  </pic:spPr>
+                </pic:pic>
+              </a:graphicData>
+            </a:graphic>
+          </wp:inline>
+        </w:drawing>
+      </w:r>
+    </w:p>
+    <w:p>
+      <w:r>
+        <w:rPr>
+          <w:rFonts w:ascii="Calibri" w:hAnsi="Calibri"/>
+        </w:rPr>
+        <w:t>El panel "p95 del sistema" promedia los p95 de cada réplica: (95.3 + 98.3 + 977.5) / 3 ≈ 390 ms, mientras el p95 real de escalado es 701.3 ms.</w:t>
+      </w:r>
+    </w:p>
+    <w:p/>
     <w:sectPr>
       <w:pgSz w:w="11906" w:h="16838"/>
       <w:pgMar w:top="1440" w:right="1440" w:bottom="1440" w:left="1440" w:header="708" w:footer="708" w:gutter="0"/>

</xml_diff>